<commit_message>
docs: adopt verified revised manuscript and supplement proofs
</commit_message>
<xml_diff>
--- a/submission/manuscript.docx
+++ b/submission/manuscript.docx
@@ -2,15 +2,14 @@
 <file path=word/document.xml><?xml version="1.0" encoding="utf-8"?>
 <w:document xmlns:w="http://schemas.openxmlformats.org/wordprocessingml/2006/main" xmlns:m="http://schemas.openxmlformats.org/officeDocument/2006/math" xmlns:r="http://schemas.openxmlformats.org/officeDocument/2006/relationships" xmlns:o="urn:schemas-microsoft-com:office:office" xmlns:v="urn:schemas-microsoft-com:vml" xmlns:w10="urn:schemas-microsoft-com:office:word" xmlns:a="http://schemas.openxmlformats.org/drawingml/2006/main" xmlns:pic="http://schemas.openxmlformats.org/drawingml/2006/picture" xmlns:wp="http://schemas.openxmlformats.org/drawingml/2006/wordprocessingDrawing">
   <w:body>
+    <w:bookmarkStart w:id="34" w:name="X896931a6a2540f16511342ee534cc6b16733667"/>
     <w:p>
       <w:pPr>
         <w:pStyle w:val="Heading1"/>
       </w:pPr>
-      <w:bookmarkStart w:id="20" w:name="X896931a6a2540f16511342ee534cc6b16733667"/>
       <w:r>
         <w:t xml:space="preserve">BWTandem: FM-index seeding for wide-period-range tandem repeat detection in assembled genomes</w:t>
       </w:r>
-      <w:bookmarkEnd w:id="20"/>
     </w:p>
     <w:p>
       <w:pPr>
@@ -36,15 +35,14 @@
         <w:t xml:space="preserve">Correspondence: wyim@unr.edu</w:t>
       </w:r>
     </w:p>
+    <w:bookmarkStart w:id="20" w:name="abstract"/>
     <w:p>
       <w:pPr>
         <w:pStyle w:val="Heading2"/>
       </w:pPr>
-      <w:bookmarkStart w:id="21" w:name="abstract"/>
       <w:r>
         <w:t xml:space="preserve">Abstract</w:t>
       </w:r>
-      <w:bookmarkEnd w:id="21"/>
     </w:p>
     <w:p>
       <w:pPr>
@@ -52,15 +50,16 @@
       </w:pPr>
       <w:r>
         <w:rPr>
+          <w:bCs/>
           <w:b/>
         </w:rPr>
-        <w:t xml:space="preserve">Motivation:</w:t>
-      </w:r>
-      <w:r>
-        <w:t xml:space="preserve"> </w:t>
-      </w:r>
-      <w:r>
-        <w:t xml:space="preserve">A broad tandem-repeat search must balance period range, detection quality and computational cost.</w:t>
+        <w:t xml:space="preserve">Summary:</w:t>
+      </w:r>
+      <w:r>
+        <w:t xml:space="preserve"> </w:t>
+      </w:r>
+      <w:r>
+        <w:t xml:space="preserve">BWTandem combines FM-index seeding, candidate refinement and supplementary periodicity scans to report motifs, periods, copy counts and purity across 1–2,000 bp in assembled genomes; in three paired human runs, widening the maximum period from 100 to 2,000 bp increased runtime 1.77–1.82 times (mean 1.79). Its contribution is wide-range structured output with non-leading shared-range accuracy — shared-output-band region recall was 78.87% against ULTRA’s 81.62%, and a stratified single-reader audit supported only 4 of 400 calls absent from both the catalog and four original comparators — not a demonstrated causal speed advantage of the index.</w:t>
       </w:r>
     </w:p>
     <w:p>
@@ -69,15 +68,16 @@
       </w:pPr>
       <w:r>
         <w:rPr>
+          <w:bCs/>
           <w:b/>
         </w:rPr>
-        <w:t xml:space="preserve">Results:</w:t>
-      </w:r>
-      <w:r>
-        <w:t xml:space="preserve"> </w:t>
-      </w:r>
-      <w:r>
-        <w:t xml:space="preserve">BWTandem combines FM-index seeding, candidate refinement and supplementary periodicity scans to report motifs, periods, copy counts and purity across 1–2,000 bp. In three paired human runs, widening the maximum period from 100 to 2,000 bp increased runtime 1.77–1.82 times (mean 1.79). Shared-output-band region recall was 78.87%, below ULTRA’s 81.62%. A stratified single-reader audit supported only 4 of 400 calls absent from both the catalog and four original comparators. Plant results demonstrate satellite detection, but period assignment, fragmentation and memory remain limitations. The contribution is wide-range structured output with non-leading shared-range accuracy, not a demonstrated causal speed advantage of the index.</w:t>
+        <w:t xml:space="preserve">Availability and Implementation:</w:t>
+      </w:r>
+      <w:r>
+        <w:t xml:space="preserve"> </w:t>
+      </w:r>
+      <w:r>
+        <w:t xml:space="preserve">MIT-licensed source and scoring scripts: https://github.com/wyim-pgl/bwt-algorithm. Benchmark configurations differ from defaults (Supplementary Methods S2).</w:t>
       </w:r>
     </w:p>
     <w:p>
@@ -86,23 +86,7 @@
       </w:pPr>
       <w:r>
         <w:rPr>
-          <w:b/>
-        </w:rPr>
-        <w:t xml:space="preserve">Availability and implementation:</w:t>
-      </w:r>
-      <w:r>
-        <w:t xml:space="preserve"> </w:t>
-      </w:r>
-      <w:r>
-        <w:t xml:space="preserve">MIT-licensed source and scoring scripts: https://github.com/wyim-pgl/bwt-algorithm. Benchmark configurations differ from defaults (Supplementary Methods S2).</w:t>
-      </w:r>
-    </w:p>
-    <w:p>
-      <w:pPr>
-        <w:pStyle w:val="BodyText"/>
-      </w:pPr>
-      <w:r>
-        <w:rPr>
+          <w:bCs/>
           <w:b/>
         </w:rPr>
         <w:t xml:space="preserve">Contact:</w:t>
@@ -120,9 +104,10 @@
       </w:pPr>
       <w:r>
         <w:rPr>
+          <w:bCs/>
           <w:b/>
         </w:rPr>
-        <w:t xml:space="preserve">Supplementary information:</w:t>
+        <w:t xml:space="preserve">Supplementary Information:</w:t>
       </w:r>
       <w:r>
         <w:t xml:space="preserve"> </w:t>
@@ -131,15 +116,15 @@
         <w:t xml:space="preserve">Supplementary information accompanies this manuscript.</w:t>
       </w:r>
     </w:p>
+    <w:bookmarkEnd w:id="20"/>
+    <w:bookmarkStart w:id="21" w:name="introduction"/>
     <w:p>
       <w:pPr>
         <w:pStyle w:val="Heading2"/>
       </w:pPr>
-      <w:bookmarkStart w:id="22" w:name="introduction"/>
       <w:r>
         <w:t xml:space="preserve">1 Introduction</w:t>
       </w:r>
-      <w:bookmarkEnd w:id="22"/>
     </w:p>
     <w:p>
       <w:pPr>
@@ -149,15 +134,15 @@
         <w:t xml:space="preserve">Tandem repeats span short motifs and satellite monomers. Detectors such as TRF (Benson, 1999) and ULTRA (Olson and Wheeler, 2024) require period ceilings whose computational cost depends on the genome and implementation. BWTandem targets one broad pass over assembled genomes, with structured repeat records rather than accuracy leadership. longdust (Li and Li, 2026) reports low-complexity intervals without repeat units; AniAnn’s (Sweeten et al., 2026) reports satellite boundaries and monomer lengths but not motif sequences, copy counts or purity. Both are included in our comparison, and their advantages remain explicit.</w:t>
       </w:r>
     </w:p>
+    <w:bookmarkEnd w:id="21"/>
+    <w:bookmarkStart w:id="22" w:name="implementation-and-evaluation"/>
     <w:p>
       <w:pPr>
         <w:pStyle w:val="Heading2"/>
       </w:pPr>
-      <w:bookmarkStart w:id="23" w:name="implementation-and-evaluation"/>
       <w:r>
         <w:t xml:space="preserve">2 Implementation and evaluation</w:t>
       </w:r>
-      <w:bookmarkEnd w:id="23"/>
     </w:p>
     <w:p>
       <w:pPr>
@@ -172,18 +157,18 @@
         <w:pStyle w:val="BodyText"/>
       </w:pPr>
       <w:r>
-        <w:t xml:space="preserve">Human evaluation uses the GRCh38 primary chromosomes and the adotto variable-repeat catalog (English et al., 2024); plant evaluation uses Col-CEN and maize Mo17 (Naish et al., 2021; Chen et al., 2023). Human region recovery requires one-base overlap. Reciprocal-overlap and one-to-one sensitivity analyses are supplementary. Catalog precision is not precision against all genomic repeats. Output-period filtering matches the human comparison band, not execution ranges. Historical competitors processed additional sequences; memory measurements mix sampled cgroup peaks and GNU-time maxima. These observations do not establish matched cross-tool speedups. Human operating points and the Arabidopsis catch-all choice were selected using their evaluation truth sets; these are in-sample comparisons, and competitors did not receive an equivalent tuning search. All tables, original identifiers, detailed caveats and source links are retained in the supplement.</w:t>
-      </w:r>
-    </w:p>
+        <w:t xml:space="preserve">Human evaluation uses the GRCh38 primary chromosomes (GenBank assembly GCA_000001405.15; Genome Reference Consortium, 2013) and release v1.2.1 of the adotto variable-repeat catalog (English et al., 2024; dataset English, 2024a); plant evaluation uses Col-CEN v1.2 (Naish et al., 2021; dataset Schatzlab, n.d.) and maize Mo17 (GenBank assembly GCA_022117705.1; Chen et al., 2023; dataset China Agriculture University, n.d.). Human region recovery requires one-base overlap. Reciprocal-overlap and one-to-one sensitivity analyses are supplementary. Catalog precision is not precision against all genomic repeats. Output-period filtering matches the human comparison band, not execution ranges. Historical competitors processed additional sequences; memory measurements mix sampled cgroup peaks and GNU-time maxima. These observations do not establish matched cross-tool speedups. Human operating points and the Arabidopsis catch-all choice were selected using their evaluation truth sets; these are in-sample comparisons, and competitors did not receive an equivalent tuning search. All tables, original identifiers, detailed caveats and source links are retained in the supplement.</w:t>
+      </w:r>
+    </w:p>
+    <w:bookmarkEnd w:id="22"/>
+    <w:bookmarkStart w:id="23" w:name="results-and-limitations"/>
     <w:p>
       <w:pPr>
         <w:pStyle w:val="Heading2"/>
       </w:pPr>
-      <w:bookmarkStart w:id="24" w:name="results-and-limitations"/>
       <w:r>
         <w:t xml:space="preserve">3 Results and limitations</w:t>
       </w:r>
-      <w:bookmarkEnd w:id="24"/>
     </w:p>
     <w:p>
       <w:pPr>
@@ -240,15 +225,15 @@
         <w:t xml:space="preserve">Fragmentation, over-calling, missing historical provenance and a still-unresolved layout-dependent native regression test limit deployment claims. The benchmark does not validate all reported motif structures or establish broad generalization to unseen genomes. BWTandem offers wide-range candidate records for downstream validation, not a replacement for that validation.</w:t>
       </w:r>
     </w:p>
+    <w:bookmarkEnd w:id="23"/>
+    <w:bookmarkStart w:id="24" w:name="data-and-code-availability"/>
     <w:p>
       <w:pPr>
         <w:pStyle w:val="Heading2"/>
       </w:pPr>
-      <w:bookmarkStart w:id="25" w:name="data-and-code-availability"/>
       <w:r>
         <w:t xml:space="preserve">Data and code availability</w:t>
       </w:r>
-      <w:bookmarkEnd w:id="25"/>
     </w:p>
     <w:p>
       <w:pPr>
@@ -273,15 +258,15 @@
         <w:t xml:space="preserve">identifies regenerated benchmark code; the later submission release does not constitute a benchmark rerun. Competitor BEDs and several external inputs are not deposited. The supplement preserves the full evidence/provenance limitations and corrected strict one-to-one panels.</w:t>
       </w:r>
     </w:p>
+    <w:bookmarkEnd w:id="24"/>
+    <w:bookmarkStart w:id="25" w:name="acknowledgments"/>
     <w:p>
       <w:pPr>
         <w:pStyle w:val="Heading2"/>
       </w:pPr>
-      <w:bookmarkStart w:id="26" w:name="acknowledgments"/>
       <w:r>
         <w:t xml:space="preserve">Acknowledgments</w:t>
       </w:r>
-      <w:bookmarkEnd w:id="26"/>
     </w:p>
     <w:p>
       <w:pPr>
@@ -291,15 +276,15 @@
         <w:t xml:space="preserve">The authors acknowledge Research &amp; Innovation and the Cyberinfrastructure Team in the Office of Information Technology at the University of Nevada, Reno for access to computing resources.</w:t>
       </w:r>
     </w:p>
+    <w:bookmarkEnd w:id="25"/>
+    <w:bookmarkStart w:id="26" w:name="references"/>
     <w:p>
       <w:pPr>
         <w:pStyle w:val="Heading2"/>
       </w:pPr>
-      <w:bookmarkStart w:id="27" w:name="references"/>
       <w:r>
         <w:t xml:space="preserve">References</w:t>
       </w:r>
-      <w:bookmarkEnd w:id="27"/>
     </w:p>
     <w:p>
       <w:pPr>
@@ -313,6 +298,7 @@
       </w:r>
       <w:r>
         <w:rPr>
+          <w:iCs/>
           <w:i/>
         </w:rPr>
         <w:t xml:space="preserve">Nucleic Acids Res.</w:t>
@@ -333,6 +319,7 @@
       </w:r>
       <w:r>
         <w:rPr>
+          <w:iCs/>
           <w:i/>
         </w:rPr>
         <w:t xml:space="preserve">Nat. Genet.</w:t>
@@ -346,6 +333,14 @@
         <w:pStyle w:val="BodyText"/>
       </w:pPr>
       <w:r>
+        <w:t xml:space="preserve">China Agriculture University (n.d.) Zm-Mo17-REFERENCE-CAU-T2T-assembly assembly for Zea mays (dataset). GenBank/ENA assembly accession GCA_022117705.1. https://www.ebi.ac.uk/ena/browser/view/GCA_022117705.1</w:t>
+      </w:r>
+    </w:p>
+    <w:p>
+      <w:pPr>
+        <w:pStyle w:val="BodyText"/>
+      </w:pPr>
+      <w:r>
         <w:t xml:space="preserve">English A.C. et al. (2024) Analysis and benchmarking of small and large genomic variants across tandem repeats.</w:t>
       </w:r>
       <w:r>
@@ -353,6 +348,7 @@
       </w:r>
       <w:r>
         <w:rPr>
+          <w:iCs/>
           <w:i/>
         </w:rPr>
         <w:t xml:space="preserve">Nat. Biotechnol.</w:t>
@@ -366,6 +362,22 @@
         <w:pStyle w:val="BodyText"/>
       </w:pPr>
       <w:r>
+        <w:t xml:space="preserve">English A. (2024a) Project Adotto Tandem-Repeat Regions and Annotations, v1.2.1 (dataset). Zenodo. https://doi.org/10.5281/zenodo.13987414</w:t>
+      </w:r>
+    </w:p>
+    <w:p>
+      <w:pPr>
+        <w:pStyle w:val="BodyText"/>
+      </w:pPr>
+      <w:r>
+        <w:t xml:space="preserve">Genome Reference Consortium (2013) GRCh38 human reference genome assembly (dataset). GenBank assembly accession GCA_000001405.15. https://www.ncbi.nlm.nih.gov/datasets/genome/GCA_000001405.15/</w:t>
+      </w:r>
+    </w:p>
+    <w:p>
+      <w:pPr>
+        <w:pStyle w:val="BodyText"/>
+      </w:pPr>
+      <w:r>
         <w:t xml:space="preserve">Li H. and Li B. (2026) Finding low-complexity DNA sequences with longdust.</w:t>
       </w:r>
       <w:r>
@@ -373,6 +385,7 @@
       </w:r>
       <w:r>
         <w:rPr>
+          <w:iCs/>
           <w:i/>
         </w:rPr>
         <w:t xml:space="preserve">Bioinformatics</w:t>
@@ -393,6 +406,7 @@
       </w:r>
       <w:r>
         <w:rPr>
+          <w:iCs/>
           <w:i/>
         </w:rPr>
         <w:t xml:space="preserve">Science</w:t>
@@ -406,6 +420,14 @@
         <w:pStyle w:val="BodyText"/>
       </w:pPr>
       <w:r>
+        <w:t xml:space="preserve">Schatzlab (n.d.) Col-CEN v1.2 genome assembly (dataset), Col-CEN_v1.2.fasta.gz. GitHub. https://github.com/schatzlab/Col-CEN/tree/main/v1.2</w:t>
+      </w:r>
+    </w:p>
+    <w:p>
+      <w:pPr>
+        <w:pStyle w:val="BodyText"/>
+      </w:pPr>
+      <w:r>
         <w:t xml:space="preserve">Olson D.R. and Wheeler T.J. (2024) ULTRA-effective labeling of tandem repeats in genomic sequence.</w:t>
       </w:r>
       <w:r>
@@ -413,6 +435,7 @@
       </w:r>
       <w:r>
         <w:rPr>
+          <w:iCs/>
           <w:i/>
         </w:rPr>
         <w:t xml:space="preserve">Bioinform. Adv.</w:t>
@@ -433,6 +456,7 @@
       </w:r>
       <w:r>
         <w:rPr>
+          <w:iCs/>
           <w:i/>
         </w:rPr>
         <w:t xml:space="preserve">Bioinformatics</w:t>
@@ -441,37 +465,37 @@
         <w:t xml:space="preserve">, btag581, advance access.</w:t>
       </w:r>
     </w:p>
+    <w:bookmarkEnd w:id="26"/>
+    <w:bookmarkStart w:id="33" w:name="figure-legends"/>
     <w:p>
       <w:pPr>
         <w:pStyle w:val="Heading2"/>
       </w:pPr>
-      <w:bookmarkStart w:id="28" w:name="figure-legends"/>
       <w:r>
         <w:t xml:space="preserve">Figure legends</w:t>
       </w:r>
-      <w:bookmarkEnd w:id="28"/>
-    </w:p>
-    <w:p>
-      <w:pPr>
-        <w:pStyle w:val="CaptionedFigure"/>
+    </w:p>
+    <w:p>
+      <w:pPr>
+        <w:pStyle w:val="FirstParagraph"/>
       </w:pPr>
       <w:r>
         <w:drawing>
           <wp:inline>
-            <wp:extent cx="5334000" cy="1663770"/>
+            <wp:extent cx="5334000" cy="1482718"/>
             <wp:effectExtent b="0" l="0" r="0" t="0"/>
-            <wp:docPr descr="Paired range cost and separate cross-tool observations" title="" id="1" name="Picture"/>
+            <wp:docPr descr="Paired range cost and separate cross-tool observations" title="" id="28" name="Picture"/>
             <a:graphic>
               <a:graphicData uri="http://schemas.openxmlformats.org/drawingml/2006/picture">
                 <pic:pic>
                   <pic:nvPicPr>
-                    <pic:cNvPr descr="submission/figures/fig2_range_cost.png" id="0" name="Picture"/>
+                    <pic:cNvPr descr="submission/figures/fig2_range_cost.png" id="29" name="Picture"/>
                     <pic:cNvPicPr>
                       <a:picLocks noChangeArrowheads="1" noChangeAspect="1"/>
                     </pic:cNvPicPr>
                   </pic:nvPicPr>
                   <pic:blipFill>
-                    <a:blip r:embed="rId29"/>
+                    <a:blip r:embed="rId27"/>
                     <a:stretch>
                       <a:fillRect/>
                     </a:stretch>
@@ -479,7 +503,7 @@
                   <pic:spPr bwMode="auto">
                     <a:xfrm>
                       <a:off x="0" y="0"/>
-                      <a:ext cx="5334000" cy="1663770"/>
+                      <a:ext cx="5334000" cy="1482718"/>
                     </a:xfrm>
                     <a:prstGeom prst="rect">
                       <a:avLst/>
@@ -500,18 +524,11 @@
     </w:p>
     <w:p>
       <w:pPr>
-        <w:pStyle w:val="ImageCaption"/>
-      </w:pPr>
-      <w:r>
-        <w:t xml:space="preserve">Paired range cost and separate cross-tool observations</w:t>
-      </w:r>
-    </w:p>
-    <w:p>
-      <w:pPr>
         <w:pStyle w:val="BodyText"/>
       </w:pPr>
       <w:r>
         <w:rPr>
+          <w:bCs/>
           <w:b/>
         </w:rPr>
         <w:t xml:space="preserve">Fig. 1.</w:t>
@@ -525,19 +542,37 @@
     </w:p>
     <w:p>
       <w:pPr>
-        <w:pStyle w:val="CaptionedFigure"/>
+        <w:pStyle w:val="BodyText"/>
+      </w:pPr>
+      <w:r>
+        <w:rPr>
+          <w:bCs/>
+          <w:b/>
+        </w:rPr>
+        <w:t xml:space="preserve">Alt text:</w:t>
+      </w:r>
+      <w:r>
+        <w:t xml:space="preserve"> </w:t>
+      </w:r>
+      <w:r>
+        <w:t xml:space="preserve">Three-panel chart. Panel A is a slope chart of three paired human runs: runtime rises from about 4 hours at a 100 bp maximum period to 7.1–7.3 hours at 2,000 bp, with the per-replicate ratios 1.77–1.82 labelled beside the endpoints. Panel B shows observed ULTRA and TRF maize runtimes rising with the maximum period on log–log axes. Panel C shows dot plots of per-tool human core-hours and peak memory, each point labelled with its period cap; ranges and inputs are not matched across tools.</w:t>
+      </w:r>
+    </w:p>
+    <w:p>
+      <w:pPr>
+        <w:pStyle w:val="BodyText"/>
       </w:pPr>
       <w:r>
         <w:drawing>
           <wp:inline>
-            <wp:extent cx="5334000" cy="1848371"/>
+            <wp:extent cx="5334000" cy="1684623"/>
             <wp:effectExtent b="0" l="0" r="0" t="0"/>
-            <wp:docPr descr="Accuracy trade-offs and overlap-rule sensitivity" title="" id="1" name="Picture"/>
+            <wp:docPr descr="Accuracy trade-offs and overlap-rule sensitivity" title="" id="31" name="Picture"/>
             <a:graphic>
               <a:graphicData uri="http://schemas.openxmlformats.org/drawingml/2006/picture">
                 <pic:pic>
                   <pic:nvPicPr>
-                    <pic:cNvPr descr="submission/figures/fig1_accuracy_tradeoff.png" id="0" name="Picture"/>
+                    <pic:cNvPr descr="submission/figures/fig1_accuracy_tradeoff.png" id="32" name="Picture"/>
                     <pic:cNvPicPr>
                       <a:picLocks noChangeArrowheads="1" noChangeAspect="1"/>
                     </pic:cNvPicPr>
@@ -551,7 +586,7 @@
                   <pic:spPr bwMode="auto">
                     <a:xfrm>
                       <a:off x="0" y="0"/>
-                      <a:ext cx="5334000" cy="1848371"/>
+                      <a:ext cx="5334000" cy="1684623"/>
                     </a:xfrm>
                     <a:prstGeom prst="rect">
                       <a:avLst/>
@@ -572,18 +607,11 @@
     </w:p>
     <w:p>
       <w:pPr>
-        <w:pStyle w:val="ImageCaption"/>
-      </w:pPr>
-      <w:r>
-        <w:t xml:space="preserve">Accuracy trade-offs and overlap-rule sensitivity</w:t>
-      </w:r>
-    </w:p>
-    <w:p>
-      <w:pPr>
         <w:pStyle w:val="BodyText"/>
       </w:pPr>
       <w:r>
         <w:rPr>
+          <w:bCs/>
           <w:b/>
         </w:rPr>
         <w:t xml:space="preserve">Fig. 2.</w:t>
@@ -595,6 +623,26 @@
         <w:t xml:space="preserve">Native-period-100 operating points (A–B) and reciprocal-overlap sensitivity of post-filtered full-range output (C). The 2026 points in A–B are full-range, not band-matched. Original Figure 1 and its complete caption are preserved as Supplementary Figure 1.</w:t>
       </w:r>
     </w:p>
+    <w:p>
+      <w:pPr>
+        <w:pStyle w:val="BodyText"/>
+      </w:pPr>
+      <w:r>
+        <w:rPr>
+          <w:bCs/>
+          <w:b/>
+        </w:rPr>
+        <w:t xml:space="preserve">Alt text:</w:t>
+      </w:r>
+      <w:r>
+        <w:t xml:space="preserve"> </w:t>
+      </w:r>
+      <w:r>
+        <w:t xml:space="preserve">Three-panel chart. Panels A and B plot region-level and base-pair precision against recall on GRCh38: BWTandem’s four operating points P, B, F and H form a connected line whose precision falls as recall rises, and each competing tool is a single labelled point. Panel C plots region recall at periods of 100 bp or less under the one-base, reciprocal-0.25 and reciprocal-0.50 overlap rules; every tool’s recall falls under the stricter rules, with ULTRA highest and BWTandem second throughout.</w:t>
+      </w:r>
+    </w:p>
+    <w:bookmarkEnd w:id="33"/>
+    <w:bookmarkEnd w:id="34"/>
     <w:sectPr/>
   </w:body>
 </w:document>
@@ -626,17 +674,14 @@
 <file path=word/numbering.xml><?xml version="1.0" encoding="utf-8"?>
 <w:numbering xmlns:w="http://schemas.openxmlformats.org/wordprocessingml/2006/main">
   <w:abstractNum w:abstractNumId="990">
-    <w:nsid w:val="2c1ae401"/>
+    <w:nsid w:val="A990"/>
     <w:multiLevelType w:val="multilevel"/>
     <w:lvl w:ilvl="0">
       <w:numFmt w:val="bullet"/>
       <w:lvlText w:val=" "/>
       <w:lvlJc w:val="left"/>
       <w:pPr>
-        <w:tabs>
-          <w:tab w:val="num" w:pos="0"/>
-        </w:tabs>
-        <w:ind w:left="480" w:hanging="480"/>
+        <w:ind w:left="720" w:hanging="480"/>
       </w:pPr>
     </w:lvl>
     <w:lvl w:ilvl="1">
@@ -644,10 +689,7 @@
       <w:lvlText w:val=" "/>
       <w:lvlJc w:val="left"/>
       <w:pPr>
-        <w:tabs>
-          <w:tab w:val="num" w:pos="720"/>
-        </w:tabs>
-        <w:ind w:left="1200" w:hanging="480"/>
+        <w:ind w:left="1440" w:hanging="480"/>
       </w:pPr>
     </w:lvl>
     <w:lvl w:ilvl="2">
@@ -655,10 +697,7 @@
       <w:lvlText w:val=" "/>
       <w:lvlJc w:val="left"/>
       <w:pPr>
-        <w:tabs>
-          <w:tab w:val="num" w:pos="1440"/>
-        </w:tabs>
-        <w:ind w:left="1920" w:hanging="480"/>
+        <w:ind w:left="2160" w:hanging="480"/>
       </w:pPr>
     </w:lvl>
     <w:lvl w:ilvl="3">
@@ -666,10 +705,7 @@
       <w:lvlText w:val=" "/>
       <w:lvlJc w:val="left"/>
       <w:pPr>
-        <w:tabs>
-          <w:tab w:val="num" w:pos="2160"/>
-        </w:tabs>
-        <w:ind w:left="2640" w:hanging="480"/>
+        <w:ind w:left="2880" w:hanging="480"/>
       </w:pPr>
     </w:lvl>
     <w:lvl w:ilvl="4">
@@ -677,10 +713,7 @@
       <w:lvlText w:val=" "/>
       <w:lvlJc w:val="left"/>
       <w:pPr>
-        <w:tabs>
-          <w:tab w:val="num" w:pos="2880"/>
-        </w:tabs>
-        <w:ind w:left="3360" w:hanging="480"/>
+        <w:ind w:left="3600" w:hanging="480"/>
       </w:pPr>
     </w:lvl>
     <w:lvl w:ilvl="5">
@@ -688,10 +721,7 @@
       <w:lvlText w:val=" "/>
       <w:lvlJc w:val="left"/>
       <w:pPr>
-        <w:tabs>
-          <w:tab w:val="num" w:pos="3600"/>
-        </w:tabs>
-        <w:ind w:left="4080" w:hanging="480"/>
+        <w:ind w:left="4320" w:hanging="480"/>
       </w:pPr>
     </w:lvl>
     <w:lvl w:ilvl="6">
@@ -699,10 +729,7 @@
       <w:lvlText w:val=" "/>
       <w:lvlJc w:val="left"/>
       <w:pPr>
-        <w:tabs>
-          <w:tab w:val="num" w:pos="4320"/>
-        </w:tabs>
-        <w:ind w:left="4800" w:hanging="480"/>
+        <w:ind w:left="5040" w:hanging="480"/>
       </w:pPr>
     </w:lvl>
     <w:lvl w:ilvl="7">
@@ -710,10 +737,7 @@
       <w:lvlText w:val=" "/>
       <w:lvlJc w:val="left"/>
       <w:pPr>
-        <w:tabs>
-          <w:tab w:val="num" w:pos="5040"/>
-        </w:tabs>
-        <w:ind w:left="5520" w:hanging="480"/>
+        <w:ind w:left="5760" w:hanging="480"/>
       </w:pPr>
     </w:lvl>
     <w:lvl w:ilvl="8">
@@ -721,10 +745,7 @@
       <w:lvlText w:val=" "/>
       <w:lvlJc w:val="left"/>
       <w:pPr>
-        <w:tabs>
-          <w:tab w:val="num" w:pos="5760"/>
-        </w:tabs>
-        <w:ind w:left="6240" w:hanging="480"/>
+        <w:ind w:left="6480" w:hanging="480"/>
       </w:pPr>
     </w:lvl>
   </w:abstractNum>
@@ -739,10 +760,10 @@
   <w:docDefaults>
     <w:rPrDefault>
       <w:rPr>
-        <w:rFonts w:asciiTheme="minorHAnsi" w:eastAsiaTheme="minorHAnsi" w:hAnsiTheme="minorHAnsi" w:cstheme="minorBidi"/>
+        <w:rFonts w:asciiTheme="minorHAnsi" w:cstheme="minorBidi" w:eastAsiaTheme="minorHAnsi" w:hAnsiTheme="minorHAnsi"/>
         <w:sz w:val="24"/>
         <w:szCs w:val="24"/>
-        <w:lang w:val="en-US" w:eastAsia="en-US" w:bidi="ar-SA"/>
+        <w:lang w:bidi="ar-SA" w:eastAsia="en-US" w:val="en-US"/>
       </w:rPr>
     </w:rPrDefault>
     <w:pPrDefault>
@@ -751,35 +772,35 @@
       </w:pPr>
     </w:pPrDefault>
   </w:docDefaults>
-  <w:latentStyles w:defLockedState="0" w:defUIPriority="0" w:defSemiHidden="0" w:defUnhideWhenUsed="0" w:defQFormat="0" w:count="276"/>
-  <w:style w:type="paragraph" w:default="1" w:styleId="Normal">
+  <w:latentStyles w:count="276" w:defLockedState="0" w:defQFormat="0" w:defSemiHidden="0" w:defUIPriority="0" w:defUnhideWhenUsed="0"/>
+  <w:style w:default="1" w:styleId="Normal" w:type="paragraph">
     <w:name w:val="Normal"/>
     <w:qFormat/>
   </w:style>
-  <w:style w:type="paragraph" w:styleId="BodyText">
+  <w:style w:styleId="BodyText" w:type="paragraph">
     <w:name w:val="Body Text"/>
     <w:basedOn w:val="Normal"/>
     <w:link w:val="BodyTextChar"/>
     <w:pPr>
-      <w:spacing w:before="180" w:after="180"/>
-    </w:pPr>
-    <w:qFormat/>
-  </w:style>
-  <w:style w:type="paragraph" w:customStyle="1" w:styleId="FirstParagraph">
+      <w:spacing w:after="180" w:before="180"/>
+    </w:pPr>
+    <w:qFormat/>
+  </w:style>
+  <w:style w:customStyle="1" w:styleId="FirstParagraph" w:type="paragraph">
     <w:name w:val="First Paragraph"/>
     <w:basedOn w:val="BodyText"/>
     <w:next w:val="BodyText"/>
     <w:qFormat/>
   </w:style>
-  <w:style w:type="paragraph" w:customStyle="1" w:styleId="Compact">
+  <w:style w:customStyle="1" w:styleId="Compact" w:type="paragraph">
     <w:name w:val="Compact"/>
     <w:basedOn w:val="BodyText"/>
     <w:qFormat/>
     <w:pPr>
-      <w:spacing w:before="36" w:after="36"/>
-    </w:pPr>
-  </w:style>
-  <w:style w:type="paragraph" w:styleId="Title">
+      <w:spacing w:after="36" w:before="36"/>
+    </w:pPr>
+  </w:style>
+  <w:style w:styleId="Title" w:type="paragraph">
     <w:name w:val="Title"/>
     <w:basedOn w:val="Normal"/>
     <w:next w:val="BodyText"/>
@@ -787,19 +808,19 @@
     <w:pPr>
       <w:keepNext/>
       <w:keepLines/>
-      <w:spacing w:before="480" w:after="240"/>
+      <w:spacing w:after="240" w:before="480"/>
       <w:jc w:val="center"/>
     </w:pPr>
     <w:rPr>
-      <w:rFonts w:asciiTheme="majorHAnsi" w:eastAsiaTheme="majorEastAsia" w:hAnsiTheme="majorHAnsi" w:cstheme="majorBidi"/>
+      <w:rFonts w:asciiTheme="majorHAnsi" w:cstheme="majorBidi" w:eastAsiaTheme="majorEastAsia" w:hAnsiTheme="majorHAnsi"/>
       <w:b/>
       <w:bCs/>
-      <w:color w:val="345A8A" w:themeColor="accent1" w:themeShade="B5"/>
+      <w:color w:themeColor="accent1" w:themeShade="B5" w:val="345A8A"/>
       <w:sz w:val="36"/>
       <w:szCs w:val="36"/>
     </w:rPr>
   </w:style>
-  <w:style w:type="paragraph" w:styleId="Subtitle">
+  <w:style w:styleId="Subtitle" w:type="paragraph">
     <w:name w:val="Subtitle"/>
     <w:basedOn w:val="Title"/>
     <w:next w:val="BodyText"/>
@@ -807,7 +828,7 @@
     <w:pPr>
       <w:keepNext/>
       <w:keepLines/>
-      <w:spacing w:before="240" w:after="240"/>
+      <w:spacing w:after="240" w:before="240"/>
       <w:jc w:val="center"/>
     </w:pPr>
     <w:rPr>
@@ -815,7 +836,7 @@
       <w:szCs w:val="30"/>
     </w:rPr>
   </w:style>
-  <w:style w:type="paragraph" w:customStyle="1" w:styleId="Author">
+  <w:style w:customStyle="1" w:styleId="Author" w:type="paragraph">
     <w:name w:val="Author"/>
     <w:next w:val="BodyText"/>
     <w:qFormat/>
@@ -825,7 +846,7 @@
       <w:jc w:val="center"/>
     </w:pPr>
   </w:style>
-  <w:style w:type="paragraph" w:styleId="Date">
+  <w:style w:styleId="Date" w:type="paragraph">
     <w:name w:val="Date"/>
     <w:next w:val="BodyText"/>
     <w:qFormat/>
@@ -835,7 +856,7 @@
       <w:jc w:val="center"/>
     </w:pPr>
   </w:style>
-  <w:style w:type="paragraph" w:customStyle="1" w:styleId="Abstract">
+  <w:style w:customStyle="1" w:styleId="Abstract" w:type="paragraph">
     <w:name w:val="Abstract"/>
     <w:basedOn w:val="Normal"/>
     <w:next w:val="BodyText"/>
@@ -843,14 +864,14 @@
     <w:pPr>
       <w:keepNext/>
       <w:keepLines/>
-      <w:spacing w:before="300" w:after="300"/>
+      <w:spacing w:after="300" w:before="300"/>
     </w:pPr>
     <w:rPr>
       <w:sz w:val="20"/>
       <w:szCs w:val="20"/>
     </w:rPr>
   </w:style>
-  <w:style w:type="paragraph" w:styleId="Bibliography">
+  <w:style w:styleId="Bibliography" w:type="paragraph">
     <w:name w:val="Bibliography"/>
     <w:basedOn w:val="Normal"/>
     <w:next w:val="Bibliography"/>
@@ -858,7 +879,7 @@
     <w:pPr/>
     <w:rPr/>
   </w:style>
-  <w:style w:type="paragraph" w:styleId="Heading1">
+  <w:style w:styleId="Heading1" w:type="paragraph">
     <w:name w:val="Heading 1"/>
     <w:basedOn w:val="Normal"/>
     <w:next w:val="BodyText"/>
@@ -867,19 +888,19 @@
     <w:pPr>
       <w:keepNext/>
       <w:keepLines/>
-      <w:spacing w:before="480" w:after="0"/>
+      <w:spacing w:after="0" w:before="480"/>
       <w:outlineLvl w:val="0"/>
     </w:pPr>
     <w:rPr>
-      <w:rFonts w:asciiTheme="majorHAnsi" w:eastAsiaTheme="majorEastAsia" w:hAnsiTheme="majorHAnsi" w:cstheme="majorBidi"/>
+      <w:rFonts w:asciiTheme="majorHAnsi" w:cstheme="majorBidi" w:eastAsiaTheme="majorEastAsia" w:hAnsiTheme="majorHAnsi"/>
       <w:b/>
       <w:bCs/>
-      <w:color w:val="4F81BD" w:themeColor="accent1"/>
+      <w:color w:themeColor="accent1" w:val="4F81BD"/>
       <w:sz w:val="32"/>
       <w:szCs w:val="32"/>
     </w:rPr>
   </w:style>
-  <w:style w:type="paragraph" w:styleId="Heading2">
+  <w:style w:styleId="Heading2" w:type="paragraph">
     <w:name w:val="Heading 2"/>
     <w:basedOn w:val="Normal"/>
     <w:next w:val="BodyText"/>
@@ -889,19 +910,19 @@
     <w:pPr>
       <w:keepNext/>
       <w:keepLines/>
-      <w:spacing w:before="200" w:after="0"/>
+      <w:spacing w:after="0" w:before="200"/>
       <w:outlineLvl w:val="1"/>
     </w:pPr>
     <w:rPr>
-      <w:rFonts w:asciiTheme="majorHAnsi" w:eastAsiaTheme="majorEastAsia" w:hAnsiTheme="majorHAnsi" w:cstheme="majorBidi"/>
+      <w:rFonts w:asciiTheme="majorHAnsi" w:cstheme="majorBidi" w:eastAsiaTheme="majorEastAsia" w:hAnsiTheme="majorHAnsi"/>
       <w:b/>
       <w:bCs/>
-      <w:color w:val="4F81BD" w:themeColor="accent1"/>
+      <w:color w:themeColor="accent1" w:val="4F81BD"/>
       <w:sz w:val="28"/>
       <w:szCs w:val="28"/>
     </w:rPr>
   </w:style>
-  <w:style w:type="paragraph" w:styleId="Heading3">
+  <w:style w:styleId="Heading3" w:type="paragraph">
     <w:name w:val="Heading 3"/>
     <w:basedOn w:val="Normal"/>
     <w:next w:val="BodyText"/>
@@ -911,19 +932,19 @@
     <w:pPr>
       <w:keepNext/>
       <w:keepLines/>
-      <w:spacing w:before="200" w:after="0"/>
+      <w:spacing w:after="0" w:before="200"/>
       <w:outlineLvl w:val="2"/>
     </w:pPr>
     <w:rPr>
-      <w:rFonts w:asciiTheme="majorHAnsi" w:eastAsiaTheme="majorEastAsia" w:hAnsiTheme="majorHAnsi" w:cstheme="majorBidi"/>
+      <w:rFonts w:asciiTheme="majorHAnsi" w:cstheme="majorBidi" w:eastAsiaTheme="majorEastAsia" w:hAnsiTheme="majorHAnsi"/>
       <w:b/>
       <w:bCs/>
-      <w:color w:val="4F81BD" w:themeColor="accent1"/>
+      <w:color w:themeColor="accent1" w:val="4F81BD"/>
       <w:sz w:val="24"/>
       <w:szCs w:val="24"/>
     </w:rPr>
   </w:style>
-  <w:style w:type="paragraph" w:styleId="Heading4">
+  <w:style w:styleId="Heading4" w:type="paragraph">
     <w:name w:val="Heading 4"/>
     <w:basedOn w:val="Normal"/>
     <w:next w:val="BodyText"/>
@@ -933,19 +954,19 @@
     <w:pPr>
       <w:keepNext/>
       <w:keepLines/>
-      <w:spacing w:before="200" w:after="0"/>
+      <w:spacing w:after="0" w:before="200"/>
       <w:outlineLvl w:val="3"/>
     </w:pPr>
     <w:rPr>
-      <w:rFonts w:asciiTheme="majorHAnsi" w:eastAsiaTheme="majorEastAsia" w:hAnsiTheme="majorHAnsi" w:cstheme="majorBidi"/>
+      <w:rFonts w:asciiTheme="majorHAnsi" w:cstheme="majorBidi" w:eastAsiaTheme="majorEastAsia" w:hAnsiTheme="majorHAnsi"/>
       <w:i/>
       <w:bCs/>
-      <w:color w:val="4F81BD" w:themeColor="accent1"/>
+      <w:color w:themeColor="accent1" w:val="4F81BD"/>
       <w:sz w:val="24"/>
       <w:szCs w:val="24"/>
     </w:rPr>
   </w:style>
-  <w:style w:type="paragraph" w:styleId="Heading5">
+  <w:style w:styleId="Heading5" w:type="paragraph">
     <w:name w:val="Heading 5"/>
     <w:basedOn w:val="Normal"/>
     <w:next w:val="BodyText"/>
@@ -955,18 +976,18 @@
     <w:pPr>
       <w:keepNext/>
       <w:keepLines/>
-      <w:spacing w:before="200" w:after="0"/>
+      <w:spacing w:after="0" w:before="200"/>
       <w:outlineLvl w:val="4"/>
     </w:pPr>
     <w:rPr>
-      <w:rFonts w:asciiTheme="majorHAnsi" w:eastAsiaTheme="majorEastAsia" w:hAnsiTheme="majorHAnsi" w:cstheme="majorBidi"/>
+      <w:rFonts w:asciiTheme="majorHAnsi" w:cstheme="majorBidi" w:eastAsiaTheme="majorEastAsia" w:hAnsiTheme="majorHAnsi"/>
       <w:iCs/>
-      <w:color w:val="4F81BD" w:themeColor="accent1"/>
+      <w:color w:themeColor="accent1" w:val="4F81BD"/>
       <w:sz w:val="24"/>
       <w:szCs w:val="24"/>
     </w:rPr>
   </w:style>
-  <w:style w:type="paragraph" w:styleId="Heading6">
+  <w:style w:styleId="Heading6" w:type="paragraph">
     <w:name w:val="Heading 6"/>
     <w:basedOn w:val="Normal"/>
     <w:next w:val="BodyText"/>
@@ -976,17 +997,17 @@
     <w:pPr>
       <w:keepNext/>
       <w:keepLines/>
-      <w:spacing w:before="200" w:after="0"/>
+      <w:spacing w:after="0" w:before="200"/>
       <w:outlineLvl w:val="5"/>
     </w:pPr>
     <w:rPr>
-      <w:rFonts w:asciiTheme="majorHAnsi" w:eastAsiaTheme="majorEastAsia" w:hAnsiTheme="majorHAnsi" w:cstheme="majorBidi"/>
-      <w:color w:val="4F81BD" w:themeColor="accent1"/>
+      <w:rFonts w:asciiTheme="majorHAnsi" w:cstheme="majorBidi" w:eastAsiaTheme="majorEastAsia" w:hAnsiTheme="majorHAnsi"/>
+      <w:color w:themeColor="accent1" w:val="4F81BD"/>
       <w:sz w:val="24"/>
       <w:szCs w:val="24"/>
     </w:rPr>
   </w:style>
-  <w:style w:type="paragraph" w:styleId="Heading7">
+  <w:style w:styleId="Heading7" w:type="paragraph">
     <w:name w:val="Heading 7"/>
     <w:basedOn w:val="Normal"/>
     <w:next w:val="BodyText"/>
@@ -996,17 +1017,17 @@
     <w:pPr>
       <w:keepNext/>
       <w:keepLines/>
-      <w:spacing w:before="200" w:after="0"/>
+      <w:spacing w:after="0" w:before="200"/>
       <w:outlineLvl w:val="6"/>
     </w:pPr>
     <w:rPr>
-      <w:rFonts w:asciiTheme="majorHAnsi" w:eastAsiaTheme="majorEastAsia" w:hAnsiTheme="majorHAnsi" w:cstheme="majorBidi"/>
-      <w:color w:val="4F81BD" w:themeColor="accent1"/>
+      <w:rFonts w:asciiTheme="majorHAnsi" w:cstheme="majorBidi" w:eastAsiaTheme="majorEastAsia" w:hAnsiTheme="majorHAnsi"/>
+      <w:color w:themeColor="accent1" w:val="4F81BD"/>
       <w:sz w:val="24"/>
       <w:szCs w:val="24"/>
     </w:rPr>
   </w:style>
-  <w:style w:type="paragraph" w:styleId="Heading8">
+  <w:style w:styleId="Heading8" w:type="paragraph">
     <w:name w:val="Heading 8"/>
     <w:basedOn w:val="Normal"/>
     <w:next w:val="BodyText"/>
@@ -1016,17 +1037,17 @@
     <w:pPr>
       <w:keepNext/>
       <w:keepLines/>
-      <w:spacing w:before="200" w:after="0"/>
+      <w:spacing w:after="0" w:before="200"/>
       <w:outlineLvl w:val="7"/>
     </w:pPr>
     <w:rPr>
-      <w:rFonts w:asciiTheme="majorHAnsi" w:eastAsiaTheme="majorEastAsia" w:hAnsiTheme="majorHAnsi" w:cstheme="majorBidi"/>
-      <w:color w:val="4F81BD" w:themeColor="accent1"/>
+      <w:rFonts w:asciiTheme="majorHAnsi" w:cstheme="majorBidi" w:eastAsiaTheme="majorEastAsia" w:hAnsiTheme="majorHAnsi"/>
+      <w:color w:themeColor="accent1" w:val="4F81BD"/>
       <w:sz w:val="24"/>
       <w:szCs w:val="24"/>
     </w:rPr>
   </w:style>
-  <w:style w:type="paragraph" w:styleId="Heading9">
+  <w:style w:styleId="Heading9" w:type="paragraph">
     <w:name w:val="Heading 9"/>
     <w:basedOn w:val="Normal"/>
     <w:next w:val="BodyText"/>
@@ -1036,17 +1057,17 @@
     <w:pPr>
       <w:keepNext/>
       <w:keepLines/>
-      <w:spacing w:before="200" w:after="0"/>
+      <w:spacing w:after="0" w:before="200"/>
       <w:outlineLvl w:val="8"/>
     </w:pPr>
     <w:rPr>
-      <w:rFonts w:asciiTheme="majorHAnsi" w:eastAsiaTheme="majorEastAsia" w:hAnsiTheme="majorHAnsi" w:cstheme="majorBidi"/>
-      <w:color w:val="4F81BD" w:themeColor="accent1"/>
+      <w:rFonts w:asciiTheme="majorHAnsi" w:cstheme="majorBidi" w:eastAsiaTheme="majorEastAsia" w:hAnsiTheme="majorHAnsi"/>
+      <w:color w:themeColor="accent1" w:val="4F81BD"/>
       <w:sz w:val="24"/>
       <w:szCs w:val="24"/>
     </w:rPr>
   </w:style>
-  <w:style w:type="paragraph" w:styleId="BlockText">
+  <w:style w:styleId="BlockText" w:type="paragraph">
     <w:name w:val="Block Text"/>
     <w:basedOn w:val="BodyText"/>
     <w:next w:val="BodyText"/>
@@ -1054,11 +1075,11 @@
     <w:unhideWhenUsed/>
     <w:qFormat/>
     <w:pPr>
-      <w:spacing w:before="100" w:after="100"/>
+      <w:spacing w:after="100" w:before="100"/>
       <w:ind w:firstLine="0" w:left="480" w:right="480"/>
     </w:pPr>
   </w:style>
-  <w:style w:type="paragraph" w:styleId="FootnoteText">
+  <w:style w:styleId="FootnoteText" w:type="paragraph">
     <w:name w:val="Footnote Text"/>
     <w:basedOn w:val="Normal"/>
     <w:next w:val="FootnoteText"/>
@@ -1066,28 +1087,43 @@
     <w:unhideWhenUsed/>
     <w:qFormat/>
   </w:style>
-  <w:style w:type="character" w:default="1" w:styleId="DefaultParagraphFont">
+  <w:style w:default="1" w:styleId="DefaultParagraphFont" w:type="character">
     <w:name w:val="Default Paragraph Font"/>
     <w:semiHidden/>
     <w:unhideWhenUsed/>
   </w:style>
-  <w:style w:type="table" w:default="1" w:styleId="Table">
+  <w:style w:default="1" w:styleId="Table" w:type="table">
     <w:name w:val="Table"/>
     <w:basedOn w:val="TableNormal"/>
     <w:semiHidden/>
     <w:unhideWhenUsed/>
     <w:qFormat/>
     <w:tblPr>
-      <w:tblInd w:w="0" w:type="dxa"/>
+      <w:tblInd w:type="dxa" w:w="0"/>
       <w:tblCellMar>
-        <w:top w:w="0" w:type="dxa"/>
-        <w:left w:w="108" w:type="dxa"/>
-        <w:bottom w:w="0" w:type="dxa"/>
-        <w:right w:w="108" w:type="dxa"/>
+        <w:top w:type="dxa" w:w="0"/>
+        <w:left w:type="dxa" w:w="108"/>
+        <w:bottom w:type="dxa" w:w="0"/>
+        <w:right w:type="dxa" w:w="108"/>
       </w:tblCellMar>
     </w:tblPr>
-  </w:style>
-  <w:style w:type="paragraph" w:customStyle="1" w:styleId="DefinitionTerm">
+    <w:tblStylePr w:type="firstRow">
+      <w:tblPr>
+        <w:jc w:val="left"/>
+        <w:tblInd w:type="dxa" w:w="0"/>
+      </w:tblPr>
+      <w:trPr>
+        <w:jc w:val="left"/>
+      </w:trPr>
+      <w:tcPr>
+        <w:vAlign w:val="bottom"/>
+        <w:tcBorders>
+          <w:bottom w:val="single"/>
+        </w:tcBorders>
+      </w:tcPr>
+    </w:tblStylePr>
+  </w:style>
+  <w:style w:customStyle="1" w:styleId="DefinitionTerm" w:type="paragraph">
     <w:name w:val="Definition Term"/>
     <w:basedOn w:val="Normal"/>
     <w:next w:val="Definition"/>
@@ -1100,49 +1136,49 @@
       <w:b/>
     </w:rPr>
   </w:style>
-  <w:style w:type="paragraph" w:customStyle="1" w:styleId="Definition">
+  <w:style w:customStyle="1" w:styleId="Definition" w:type="paragraph">
     <w:name w:val="Definition"/>
     <w:basedOn w:val="Normal"/>
   </w:style>
-  <w:style w:type="paragraph" w:styleId="Caption">
+  <w:style w:styleId="Caption" w:type="paragraph">
     <w:name w:val="Caption"/>
     <w:basedOn w:val="Normal"/>
     <w:link w:val="BodyTextChar"/>
     <w:pPr>
-      <w:spacing w:before="0" w:after="120"/>
+      <w:spacing w:after="120" w:before="0"/>
     </w:pPr>
     <w:rPr>
       <w:i/>
     </w:rPr>
   </w:style>
-  <w:style w:type="paragraph" w:customStyle="1" w:styleId="TableCaption">
+  <w:style w:customStyle="1" w:styleId="TableCaption" w:type="paragraph">
     <w:name w:val="Table Caption"/>
     <w:basedOn w:val="Caption"/>
     <w:pPr>
       <w:keepNext/>
     </w:pPr>
   </w:style>
-  <w:style w:type="paragraph" w:customStyle="1" w:styleId="ImageCaption">
+  <w:style w:customStyle="1" w:styleId="ImageCaption" w:type="paragraph">
     <w:name w:val="Image Caption"/>
     <w:basedOn w:val="Caption"/>
   </w:style>
-  <w:style w:type="paragraph" w:customStyle="1" w:styleId="Figure">
+  <w:style w:customStyle="1" w:styleId="Figure" w:type="paragraph">
     <w:name w:val="Figure"/>
     <w:basedOn w:val="Normal"/>
   </w:style>
-  <w:style w:type="paragraph" w:customStyle="1" w:styleId="CaptionedFigure">
+  <w:style w:customStyle="1" w:styleId="CaptionedFigure" w:type="paragraph">
     <w:name w:val="Captioned Figure"/>
     <w:basedOn w:val="Figure"/>
     <w:pPr>
       <w:keepNext/>
     </w:pPr>
   </w:style>
-  <w:style w:type="character" w:customStyle="1" w:styleId="BodyTextChar">
+  <w:style w:customStyle="1" w:styleId="BodyTextChar" w:type="character">
     <w:name w:val="Body Text Char"/>
     <w:basedOn w:val="DefaultParagraphFont"/>
     <w:link w:val="BodyText"/>
   </w:style>
-  <w:style w:type="character" w:customStyle="1" w:styleId="VerbatimChar">
+  <w:style w:customStyle="1" w:styleId="VerbatimChar" w:type="character">
     <w:name w:val="Verbatim Char"/>
     <w:basedOn w:val="BodyTextChar"/>
     <w:rPr>
@@ -1150,21 +1186,25 @@
       <w:sz w:val="22"/>
     </w:rPr>
   </w:style>
-  <w:style w:type="character" w:styleId="FootnoteReference">
+  <w:style w:customStyle="1" w:styleId="SectionNumber" w:type="character">
+    <w:name w:val="Section Number"/>
+    <w:basedOn w:val="BodyTextChar"/>
+  </w:style>
+  <w:style w:styleId="FootnoteReference" w:type="character">
     <w:name w:val="Footnote Reference"/>
     <w:basedOn w:val="BodyTextChar"/>
     <w:rPr>
       <w:vertAlign w:val="superscript"/>
     </w:rPr>
   </w:style>
-  <w:style w:type="character" w:styleId="Hyperlink">
+  <w:style w:styleId="Hyperlink" w:type="character">
     <w:name w:val="Hyperlink"/>
     <w:basedOn w:val="BodyTextChar"/>
     <w:rPr>
-      <w:color w:val="4F81BD" w:themeColor="accent1"/>
-    </w:rPr>
-  </w:style>
-  <w:style w:type="paragraph" w:styleId="TOCHeading">
+      <w:color w:themeColor="accent1" w:val="4F81BD"/>
+    </w:rPr>
+  </w:style>
+  <w:style w:styleId="TOCHeading" w:type="paragraph">
     <w:name w:val="TOC Heading"/>
     <w:basedOn w:val="Heading1"/>
     <w:next w:val="BodyText"/>
@@ -1176,10 +1216,10 @@
       <w:outlineLvl w:val="9"/>
     </w:pPr>
     <w:rPr>
-      <w:rFonts w:asciiTheme="majorHAnsi" w:eastAsiaTheme="majorEastAsia" w:hAnsiTheme="majorHAnsi" w:cstheme="majorBidi"/>
+      <w:rFonts w:asciiTheme="majorHAnsi" w:cstheme="majorBidi" w:eastAsiaTheme="majorEastAsia" w:hAnsiTheme="majorHAnsi"/>
       <w:b w:val="0"/>
       <w:bCs w:val="0"/>
-      <w:color w:val="365F91" w:themeColor="accent1" w:themeShade="BF"/>
+      <w:color w:themeColor="accent1" w:themeShade="BF" w:val="365F91"/>
     </w:rPr>
   </w:style>
   <w:style w:type="paragraph" w:customStyle="1" w:styleId="SourceCode">
@@ -1271,7 +1311,10 @@
   <w:style w:type="character" w:customStyle="1" w:styleId="ImportTok">
     <w:name w:val="ImportTok"/>
     <w:basedOn w:val="VerbatimChar"/>
-    <w:rPr/>
+    <w:rPr>
+      <w:color w:val="008000"/>
+      <w:b/>
+    </w:rPr>
   </w:style>
   <w:style w:type="character" w:customStyle="1" w:styleId="CommentTok">
     <w:name w:val="CommentTok"/>
@@ -1346,7 +1389,9 @@
   <w:style w:type="character" w:customStyle="1" w:styleId="BuiltInTok">
     <w:name w:val="BuiltInTok"/>
     <w:basedOn w:val="VerbatimChar"/>
-    <w:rPr/>
+    <w:rPr>
+      <w:color w:val="008000"/>
+    </w:rPr>
   </w:style>
   <w:style w:type="character" w:customStyle="1" w:styleId="ExtensionTok">
     <w:name w:val="ExtensionTok"/>

</xml_diff>

<commit_message>
docs: lightly copyedit manuscript and apply lab-style DOCX tables
</commit_message>
<xml_diff>
--- a/submission/manuscript.docx
+++ b/submission/manuscript.docx
@@ -149,15 +149,15 @@
         <w:pStyle w:val="FirstParagraph"/>
       </w:pPr>
       <w:r>
-        <w:t xml:space="preserve">A chromosome-level FM-index supports short-motif enumeration and sampled-k-mer occurrence queries. Three overlapping detection tiers combine short-repeat scanning, longest-common-prefix analysis and sparse seeding with candidate refinement. Satellite gap filling and an optional catch-all pass use autocorrelation, not index queries. Reported performance belongs to this complete pipeline; human and maize benchmarks enable the catch-all pass, whereas Arabidopsis does not. Supplementary Sections 2.1–2.2 and Methods S1–S2 specify gates, configurations and scoring.</w:t>
-      </w:r>
-    </w:p>
-    <w:p>
-      <w:pPr>
-        <w:pStyle w:val="BodyText"/>
-      </w:pPr>
-      <w:r>
-        <w:t xml:space="preserve">Human evaluation uses the GRCh38 primary chromosomes (GenBank assembly GCA_000001405.15; Genome Reference Consortium, 2013) and release v1.2.1 of the adotto variable-repeat catalog (English et al., 2024; dataset English, 2024a); plant evaluation uses Col-CEN v1.2 (Naish et al., 2021; dataset Schatzlab, n.d.) and maize Mo17 (GenBank assembly GCA_022117705.1; Chen et al., 2023; dataset China Agriculture University, n.d.). Human region recovery requires one-base overlap. Reciprocal-overlap and one-to-one sensitivity analyses are supplementary. Catalog precision is not precision against all genomic repeats. Output-period filtering matches the human comparison band, not execution ranges. Historical competitors processed additional sequences; memory measurements mix sampled cgroup peaks and GNU-time maxima. These observations do not establish matched cross-tool speedups. Human operating points and the Arabidopsis catch-all choice were selected using their evaluation truth sets; these are in-sample comparisons, and competitors did not receive an equivalent tuning search. All tables, original identifiers, detailed caveats and source links are retained in the supplement.</w:t>
+        <w:t xml:space="preserve">A chromosome-level FM-index supports short-motif enumeration and sampled-k-mer occurrence queries. Three overlapping detection tiers combine short-repeat scanning, longest-common-prefix analysis and sparse seeding with candidate refinement. Satellite gap filling and an optional catch-all pass use autocorrelation, not index queries. Reported performance reflects this complete pipeline; human and maize benchmarks enable the catch-all pass, whereas Arabidopsis does not. Supplementary Sections 2.1–2.2 and Methods S1–S2 specify gates, configurations and scoring.</w:t>
+      </w:r>
+    </w:p>
+    <w:p>
+      <w:pPr>
+        <w:pStyle w:val="BodyText"/>
+      </w:pPr>
+      <w:r>
+        <w:t xml:space="preserve">Human evaluation uses the GRCh38 primary chromosomes (GenBank assembly GCA_000001405.15; Genome Reference Consortium, 2013) and release v1.2.1 of the adotto variable-repeat catalog (English et al., 2024; dataset English, 2024a); plant evaluation uses Col-CEN v1.2 (Naish et al., 2021; dataset Schatzlab, n.d.) and maize Mo17 (GenBank assembly GCA_022117705.1; Chen et al., 2023; dataset China Agriculture University, n.d.). Human region recovery requires one-base overlap. Reciprocal-overlap and one-to-one sensitivity analyses are provided in the supplement. Catalog precision is not precision against all genomic repeats. Output-period filtering matches the human comparison band, not execution ranges. Historical competitors processed additional sequences; memory measurements mix sampled cgroup peaks and GNU-time maxima. These observations do not establish matched cross-tool speedups. Human operating points and the Arabidopsis catch-all choice were selected using their evaluation truth sets; these are in-sample comparisons, and competitors did not receive an equivalent tuning search. All tables, original identifiers, detailed caveats and source links are retained in the supplement.</w:t>
       </w:r>
     </w:p>
     <w:bookmarkEnd w:id="22"/>
@@ -190,7 +190,7 @@
         <w:t xml:space="preserve"> </w:t>
       </w:r>
       <w:r>
-        <w:t xml:space="preserve">changed only the maximum period, from 100 to 2,000 bp. Runtime ratios were 1.77–1.82, with mean 1.79 (Fig. 1). Two replicates shared a node. This is a sublinear response over two measured ceilings, not an asymptotic bound. The earlier 1.30–1.41 estimate is superseded: its narrow arm still searched and discarded long-period candidates. A historical Tier-2/3 lookup substitution changed Arabidopsis runtime by 5.56% without changing output, but retained the index; it was not an index-free pipeline ablation.</w:t>
+        <w:t xml:space="preserve">changed only the maximum period, from 100 to 2,000 bp. Runtime ratios were 1.77–1.82, with a mean of 1.79 (Fig. 1). Two replicates shared a node. This is a sublinear response over two measured ceilings, not an asymptotic bound. The earlier 1.30–1.41 estimate is superseded: its narrow arm still searched and discarded long-period candidates. A historical Tier-2/3 lookup substitution changed Arabidopsis runtime by 5.56% without changing output, but retained the index; it was not an index-free pipeline ablation.</w:t>
       </w:r>
     </w:p>
     <w:p>
@@ -240,7 +240,7 @@
         <w:pStyle w:val="FirstParagraph"/>
       </w:pPr>
       <w:r>
-        <w:t xml:space="preserve">Source, scorers, regenerated BWTandem BEDs and hashed evidence are in the repository linked above. Execution commit</w:t>
+        <w:t xml:space="preserve">Source code, scorers, regenerated BWTandem BEDs and hashed evidence are in the repository linked above. Execution commit</w:t>
       </w:r>
       <w:r>
         <w:t xml:space="preserve"> </w:t>

</xml_diff>

<commit_message>
docs: adopt verified lab-style Word manuscripts and proofs
</commit_message>
<xml_diff>
--- a/submission/manuscript.docx
+++ b/submission/manuscript.docx
@@ -6,32 +6,76 @@
     <w:p>
       <w:pPr>
         <w:pStyle w:val="Heading1"/>
-      </w:pPr>
-      <w:r>
+        <w:ind w:firstLine="0"/>
+      </w:pPr>
+      <w:r>
+        <w:rPr>
+          <w:rFonts w:ascii="Times New Roman" w:hAnsi="Times New Roman" w:eastAsia="Times New Roman" w:cs="Times New Roman"/>
+          <w:b w:val="1"/>
+          <w:bCs w:val="1"/>
+          <w:color w:val="000000"/>
+        </w:rPr>
         <w:t xml:space="preserve">BWTandem: FM-index seeding for wide-period-range tandem repeat detection in assembled genomes</w:t>
       </w:r>
     </w:p>
     <w:p>
       <w:pPr>
         <w:pStyle w:val="FirstParagraph"/>
-      </w:pPr>
-      <w:r>
+        <w:ind w:firstLine="0"/>
+        <w:jc w:val="left"/>
+      </w:pPr>
+      <w:r>
+        <w:rPr>
+          <w:rFonts w:ascii="Times New Roman" w:hAnsi="Times New Roman" w:eastAsia="Times New Roman" w:cs="Times New Roman"/>
+          <w:color w:val="000000"/>
+        </w:rPr>
         <w:t xml:space="preserve">Filip Ramazan and Won C. Yim</w:t>
       </w:r>
     </w:p>
     <w:p>
       <w:pPr>
+        <w:pStyle w:val="Affiliation"/>
+        <w:ind w:firstLine="0"/>
+      </w:pPr>
+      <w:r>
+        <w:rPr>
+          <w:rFonts w:ascii="Times New Roman" w:hAnsi="Times New Roman" w:eastAsia="Times New Roman" w:cs="Times New Roman"/>
+          <w:color w:val="000000"/>
+        </w:rPr>
+        <w:t xml:space="preserve">Department of Biochemistry and Molecular Biology</w:t>
+      </w:r>
+      <w:r>
+        <w:br/>
+      </w:r>
+      <w:r>
+        <w:rPr>
+          <w:rFonts w:ascii="Times New Roman" w:hAnsi="Times New Roman" w:eastAsia="Times New Roman" w:cs="Times New Roman"/>
+          <w:color w:val="000000"/>
+        </w:rPr>
+        <w:t xml:space="preserve">University of Nevada, Reno</w:t>
+      </w:r>
+      <w:r>
+        <w:br/>
+      </w:r>
+      <w:r>
+        <w:rPr>
+          <w:rFonts w:ascii="Times New Roman" w:hAnsi="Times New Roman" w:eastAsia="Times New Roman" w:cs="Times New Roman"/>
+          <w:color w:val="000000"/>
+        </w:rPr>
+        <w:t xml:space="preserve">Reno, NV 89557, USA</w:t>
+      </w:r>
+    </w:p>
+    <w:p>
+      <w:pPr>
         <w:pStyle w:val="BodyText"/>
-      </w:pPr>
-      <w:r>
-        <w:t xml:space="preserve">Department of Biochemistry and Molecular Biology, University of Nevada, Reno, NV 89557, USA</w:t>
-      </w:r>
-    </w:p>
-    <w:p>
-      <w:pPr>
-        <w:pStyle w:val="BodyText"/>
-      </w:pPr>
-      <w:r>
+        <w:ind w:firstLine="360"/>
+        <w:jc w:val="left"/>
+      </w:pPr>
+      <w:r>
+        <w:rPr>
+          <w:rFonts w:ascii="Times New Roman" w:hAnsi="Times New Roman" w:eastAsia="Times New Roman" w:cs="Times New Roman"/>
+          <w:color w:val="000000"/>
+        </w:rPr>
         <w:t xml:space="preserve">Correspondence: wyim@unr.edu</w:t>
       </w:r>
     </w:p>
@@ -39,80 +83,135 @@
     <w:p>
       <w:pPr>
         <w:pStyle w:val="Heading2"/>
-      </w:pPr>
-      <w:r>
+        <w:ind w:firstLine="0"/>
+      </w:pPr>
+      <w:r>
+        <w:rPr>
+          <w:rFonts w:ascii="Times New Roman" w:hAnsi="Times New Roman" w:eastAsia="Times New Roman" w:cs="Times New Roman"/>
+          <w:b w:val="1"/>
+          <w:bCs w:val="1"/>
+          <w:color w:val="000000"/>
+        </w:rPr>
         <w:t xml:space="preserve">Abstract</w:t>
       </w:r>
     </w:p>
     <w:p>
       <w:pPr>
         <w:pStyle w:val="FirstParagraph"/>
-      </w:pPr>
-      <w:r>
-        <w:rPr>
+        <w:ind w:firstLine="0"/>
+        <w:jc w:val="left"/>
+      </w:pPr>
+      <w:r>
+        <w:rPr>
+          <w:rFonts w:ascii="Times New Roman" w:hAnsi="Times New Roman" w:eastAsia="Times New Roman" w:cs="Times New Roman"/>
           <w:bCs/>
           <w:b/>
+          <w:color w:val="000000"/>
         </w:rPr>
         <w:t xml:space="preserve">Summary:</w:t>
       </w:r>
       <w:r>
+        <w:rPr>
+          <w:rFonts w:ascii="Times New Roman" w:hAnsi="Times New Roman" w:eastAsia="Times New Roman" w:cs="Times New Roman"/>
+          <w:color w:val="000000"/>
+        </w:rPr>
         <w:t xml:space="preserve"> </w:t>
       </w:r>
       <w:r>
-        <w:t xml:space="preserve">BWTandem combines FM-index seeding, candidate refinement and supplementary periodicity scans to report motifs, periods, copy counts and purity across 1–2,000 bp in assembled genomes; in three paired human runs, widening the maximum period from 100 to 2,000 bp increased runtime 1.77–1.82 times (mean 1.79). Its contribution is wide-range structured output with non-leading shared-range accuracy — shared-output-band region recall was 78.87% against ULTRA’s 81.62%, and a stratified single-reader audit supported only 4 of 400 calls absent from both the catalog and four original comparators — not a demonstrated causal speed advantage of the index.</w:t>
+        <w:rPr>
+          <w:rFonts w:ascii="Times New Roman" w:hAnsi="Times New Roman" w:eastAsia="Times New Roman" w:cs="Times New Roman"/>
+          <w:color w:val="000000"/>
+        </w:rPr>
+        <w:t xml:space="preserve">BWTandem combines FM-index seeding, candidate refinement and supplementary periodicity scans to report motifs, periods, copy counts and purity across 1-2,000 bp in assembled genomes; in three paired human runs, widening the maximum period from 100 to 2,000 bp increased runtime 1.77-1.82 times (mean 1.79). Its contribution is wide-range structured output with non-leading shared-range accuracy: shared-output-band region recall was 78.87% against ULTRA's 81.62%, and a stratified single-reader audit supported only 4 of 400 calls absent from both the catalog and four original comparators; a causal speed advantage of the index was not demonstrated.</w:t>
       </w:r>
     </w:p>
     <w:p>
       <w:pPr>
         <w:pStyle w:val="BodyText"/>
-      </w:pPr>
-      <w:r>
-        <w:rPr>
+        <w:ind w:firstLine="360"/>
+        <w:jc w:val="left"/>
+      </w:pPr>
+      <w:r>
+        <w:rPr>
+          <w:rFonts w:ascii="Times New Roman" w:hAnsi="Times New Roman" w:eastAsia="Times New Roman" w:cs="Times New Roman"/>
           <w:bCs/>
           <w:b/>
+          <w:color w:val="000000"/>
         </w:rPr>
         <w:t xml:space="preserve">Availability and Implementation:</w:t>
       </w:r>
       <w:r>
+        <w:rPr>
+          <w:rFonts w:ascii="Times New Roman" w:hAnsi="Times New Roman" w:eastAsia="Times New Roman" w:cs="Times New Roman"/>
+          <w:color w:val="000000"/>
+        </w:rPr>
         <w:t xml:space="preserve"> </w:t>
       </w:r>
       <w:r>
+        <w:rPr>
+          <w:rFonts w:ascii="Times New Roman" w:hAnsi="Times New Roman" w:eastAsia="Times New Roman" w:cs="Times New Roman"/>
+          <w:color w:val="000000"/>
+        </w:rPr>
         <w:t xml:space="preserve">MIT-licensed source and scoring scripts: https://github.com/wyim-pgl/bwt-algorithm. Benchmark configurations differ from defaults (Supplementary Methods S2).</w:t>
       </w:r>
     </w:p>
     <w:p>
       <w:pPr>
         <w:pStyle w:val="BodyText"/>
-      </w:pPr>
-      <w:r>
-        <w:rPr>
+        <w:ind w:firstLine="360"/>
+        <w:jc w:val="left"/>
+      </w:pPr>
+      <w:r>
+        <w:rPr>
+          <w:rFonts w:ascii="Times New Roman" w:hAnsi="Times New Roman" w:eastAsia="Times New Roman" w:cs="Times New Roman"/>
           <w:bCs/>
           <w:b/>
+          <w:color w:val="000000"/>
         </w:rPr>
         <w:t xml:space="preserve">Contact:</w:t>
       </w:r>
       <w:r>
+        <w:rPr>
+          <w:rFonts w:ascii="Times New Roman" w:hAnsi="Times New Roman" w:eastAsia="Times New Roman" w:cs="Times New Roman"/>
+          <w:color w:val="000000"/>
+        </w:rPr>
         <w:t xml:space="preserve"> </w:t>
       </w:r>
       <w:r>
+        <w:rPr>
+          <w:rFonts w:ascii="Times New Roman" w:hAnsi="Times New Roman" w:eastAsia="Times New Roman" w:cs="Times New Roman"/>
+          <w:color w:val="000000"/>
+        </w:rPr>
         <w:t xml:space="preserve">wyim@unr.edu</w:t>
       </w:r>
     </w:p>
     <w:p>
       <w:pPr>
         <w:pStyle w:val="BodyText"/>
-      </w:pPr>
-      <w:r>
-        <w:rPr>
+        <w:ind w:firstLine="360"/>
+        <w:jc w:val="left"/>
+      </w:pPr>
+      <w:r>
+        <w:rPr>
+          <w:rFonts w:ascii="Times New Roman" w:hAnsi="Times New Roman" w:eastAsia="Times New Roman" w:cs="Times New Roman"/>
           <w:bCs/>
           <w:b/>
+          <w:color w:val="000000"/>
         </w:rPr>
         <w:t xml:space="preserve">Supplementary Information:</w:t>
       </w:r>
       <w:r>
+        <w:rPr>
+          <w:rFonts w:ascii="Times New Roman" w:hAnsi="Times New Roman" w:eastAsia="Times New Roman" w:cs="Times New Roman"/>
+          <w:color w:val="000000"/>
+        </w:rPr>
         <w:t xml:space="preserve"> </w:t>
       </w:r>
       <w:r>
+        <w:rPr>
+          <w:rFonts w:ascii="Times New Roman" w:hAnsi="Times New Roman" w:eastAsia="Times New Roman" w:cs="Times New Roman"/>
+          <w:color w:val="000000"/>
+        </w:rPr>
         <w:t xml:space="preserve">Supplementary information accompanies this manuscript.</w:t>
       </w:r>
     </w:p>
@@ -121,17 +220,86 @@
     <w:p>
       <w:pPr>
         <w:pStyle w:val="Heading2"/>
-      </w:pPr>
-      <w:r>
+        <w:ind w:firstLine="0"/>
+      </w:pPr>
+      <w:r>
+        <w:rPr>
+          <w:rFonts w:ascii="Times New Roman" w:hAnsi="Times New Roman" w:eastAsia="Times New Roman" w:cs="Times New Roman"/>
+          <w:b w:val="1"/>
+          <w:bCs w:val="1"/>
+          <w:color w:val="000000"/>
+        </w:rPr>
         <w:t xml:space="preserve">1 Introduction</w:t>
       </w:r>
     </w:p>
     <w:p>
       <w:pPr>
         <w:pStyle w:val="FirstParagraph"/>
-      </w:pPr>
-      <w:r>
-        <w:t xml:space="preserve">Tandem repeats span short motifs and satellite monomers. Detectors such as TRF (Benson, 1999) and ULTRA (Olson and Wheeler, 2024) require period ceilings whose computational cost depends on the genome and implementation. BWTandem targets one broad pass over assembled genomes, with structured repeat records rather than accuracy leadership. longdust (Li and Li, 2026) reports low-complexity intervals without repeat units; AniAnn’s (Sweeten et al., 2026) reports satellite boundaries and monomer lengths but not motif sequences, copy counts or purity. Both are included in our comparison, and their advantages remain explicit.</w:t>
+        <w:ind w:firstLine="0"/>
+        <w:jc w:val="left"/>
+      </w:pPr>
+      <w:r>
+        <w:rPr>
+          <w:rFonts w:ascii="Times New Roman" w:hAnsi="Times New Roman" w:eastAsia="Times New Roman" w:cs="Times New Roman"/>
+          <w:color w:val="000000"/>
+        </w:rPr>
+        <w:t xml:space="preserve">Tandem repeats span short motifs and satellite monomers. Detectors such as TRF </w:t>
+      </w:r>
+      <w:r>
+        <w:rPr>
+          <w:rFonts w:ascii="Times New Roman" w:hAnsi="Times New Roman" w:eastAsia="Times New Roman" w:cs="Times New Roman"/>
+          <w:color w:val="3399FF"/>
+        </w:rPr>
+        <w:t xml:space="preserve">(Benson, 1999)</w:t>
+      </w:r>
+      <w:r>
+        <w:rPr>
+          <w:rFonts w:ascii="Times New Roman" w:hAnsi="Times New Roman" w:eastAsia="Times New Roman" w:cs="Times New Roman"/>
+          <w:color w:val="000000"/>
+        </w:rPr>
+        <w:t xml:space="preserve"> and ULTRA </w:t>
+      </w:r>
+      <w:r>
+        <w:rPr>
+          <w:rFonts w:ascii="Times New Roman" w:hAnsi="Times New Roman" w:eastAsia="Times New Roman" w:cs="Times New Roman"/>
+          <w:color w:val="3399FF"/>
+        </w:rPr>
+        <w:t xml:space="preserve">(Olson and Wheeler, 2024)</w:t>
+      </w:r>
+      <w:r>
+        <w:rPr>
+          <w:rFonts w:ascii="Times New Roman" w:hAnsi="Times New Roman" w:eastAsia="Times New Roman" w:cs="Times New Roman"/>
+          <w:color w:val="000000"/>
+        </w:rPr>
+        <w:t xml:space="preserve"> require period ceilings whose computational cost depends on the genome and implementation. BWTandem targets one broad pass over assembled genomes, with structured repeat records rather than accuracy leadership. longdust </w:t>
+      </w:r>
+      <w:r>
+        <w:rPr>
+          <w:rFonts w:ascii="Times New Roman" w:hAnsi="Times New Roman" w:eastAsia="Times New Roman" w:cs="Times New Roman"/>
+          <w:color w:val="3399FF"/>
+        </w:rPr>
+        <w:t xml:space="preserve">(Li and Li, 2026)</w:t>
+      </w:r>
+      <w:r>
+        <w:rPr>
+          <w:rFonts w:ascii="Times New Roman" w:hAnsi="Times New Roman" w:eastAsia="Times New Roman" w:cs="Times New Roman"/>
+          <w:color w:val="000000"/>
+        </w:rPr>
+        <w:t xml:space="preserve"> reports low-complexity intervals without repeat units; AniAnn's </w:t>
+      </w:r>
+      <w:r>
+        <w:rPr>
+          <w:rFonts w:ascii="Times New Roman" w:hAnsi="Times New Roman" w:eastAsia="Times New Roman" w:cs="Times New Roman"/>
+          <w:color w:val="3399FF"/>
+        </w:rPr>
+        <w:t xml:space="preserve">(Sweeten et al., 2026)</w:t>
+      </w:r>
+      <w:r>
+        <w:rPr>
+          <w:rFonts w:ascii="Times New Roman" w:hAnsi="Times New Roman" w:eastAsia="Times New Roman" w:cs="Times New Roman"/>
+          <w:color w:val="000000"/>
+        </w:rPr>
+        <w:t xml:space="preserve"> reports satellite boundaries and monomer lengths but not motif sequences, copy counts or purity. Both are included in our comparison, and their advantages remain explicit.</w:t>
       </w:r>
     </w:p>
     <w:bookmarkEnd w:id="21"/>
@@ -139,25 +307,128 @@
     <w:p>
       <w:pPr>
         <w:pStyle w:val="Heading2"/>
-      </w:pPr>
-      <w:r>
+        <w:ind w:firstLine="0"/>
+      </w:pPr>
+      <w:r>
+        <w:rPr>
+          <w:rFonts w:ascii="Times New Roman" w:hAnsi="Times New Roman" w:eastAsia="Times New Roman" w:cs="Times New Roman"/>
+          <w:b w:val="1"/>
+          <w:bCs w:val="1"/>
+          <w:color w:val="000000"/>
+        </w:rPr>
         <w:t xml:space="preserve">2 Implementation and evaluation</w:t>
       </w:r>
     </w:p>
     <w:p>
       <w:pPr>
         <w:pStyle w:val="FirstParagraph"/>
-      </w:pPr>
-      <w:r>
-        <w:t xml:space="preserve">A chromosome-level FM-index supports short-motif enumeration and sampled-k-mer occurrence queries. Three overlapping detection tiers combine short-repeat scanning, longest-common-prefix analysis and sparse seeding with candidate refinement. Satellite gap filling and an optional catch-all pass use autocorrelation, not index queries. Reported performance reflects this complete pipeline; human and maize benchmarks enable the catch-all pass, whereas Arabidopsis does not. Supplementary Sections 2.1–2.2 and Methods S1–S2 specify gates, configurations and scoring.</w:t>
+        <w:ind w:firstLine="0"/>
+        <w:jc w:val="left"/>
+      </w:pPr>
+      <w:r>
+        <w:rPr>
+          <w:rFonts w:ascii="Times New Roman" w:hAnsi="Times New Roman" w:eastAsia="Times New Roman" w:cs="Times New Roman"/>
+          <w:color w:val="000000"/>
+        </w:rPr>
+        <w:t xml:space="preserve">A chromosome-level FM-index supports short-motif enumeration and sampled-k-mer occurrence queries. Three overlapping detection tiers combine short-repeat scanning, longest-common-prefix analysis and sparse seeding with candidate refinement. Satellite gap filling and an optional catch-all pass use autocorrelation, not index queries. Reported performance reflects this complete pipeline; human and maize benchmarks enable the catch-all pass, whereas Arabidopsis does not. Supplementary Sections 2.1-2.2 and Methods S1-S2 specify gates, configurations and scoring.</w:t>
       </w:r>
     </w:p>
     <w:p>
       <w:pPr>
         <w:pStyle w:val="BodyText"/>
-      </w:pPr>
-      <w:r>
-        <w:t xml:space="preserve">Human evaluation uses the GRCh38 primary chromosomes (GenBank assembly GCA_000001405.15; Genome Reference Consortium, 2013) and release v1.2.1 of the adotto variable-repeat catalog (English et al., 2024; dataset English, 2024a); plant evaluation uses Col-CEN v1.2 (Naish et al., 2021; dataset Schatzlab, n.d.) and maize Mo17 (GenBank assembly GCA_022117705.1; Chen et al., 2023; dataset China Agriculture University, n.d.). Human region recovery requires one-base overlap. Reciprocal-overlap and one-to-one sensitivity analyses are provided in the supplement. Catalog precision is not precision against all genomic repeats. Output-period filtering matches the human comparison band, not execution ranges. Historical competitors processed additional sequences; memory measurements mix sampled cgroup peaks and GNU-time maxima. These observations do not establish matched cross-tool speedups. Human operating points and the Arabidopsis catch-all choice were selected using their evaluation truth sets; these are in-sample comparisons, and competitors did not receive an equivalent tuning search. All tables, original identifiers, detailed caveats and source links are retained in the supplement.</w:t>
+        <w:ind w:firstLine="360"/>
+        <w:jc w:val="left"/>
+      </w:pPr>
+      <w:r>
+        <w:rPr>
+          <w:rFonts w:ascii="Times New Roman" w:hAnsi="Times New Roman" w:eastAsia="Times New Roman" w:cs="Times New Roman"/>
+          <w:color w:val="000000"/>
+        </w:rPr>
+        <w:t xml:space="preserve">Human evaluation uses the primary chromosomes of GRCh38, GenBank assembly GCA_000001405.15 </w:t>
+      </w:r>
+      <w:r>
+        <w:rPr>
+          <w:rFonts w:ascii="Times New Roman" w:hAnsi="Times New Roman" w:eastAsia="Times New Roman" w:cs="Times New Roman"/>
+          <w:color w:val="3399FF"/>
+        </w:rPr>
+        <w:t xml:space="preserve">(Genome Reference Consortium, 2013)</w:t>
+      </w:r>
+      <w:r>
+        <w:rPr>
+          <w:rFonts w:ascii="Times New Roman" w:hAnsi="Times New Roman" w:eastAsia="Times New Roman" w:cs="Times New Roman"/>
+          <w:color w:val="000000"/>
+        </w:rPr>
+        <w:t xml:space="preserve">, and release v1.2.1 of the adotto variable-repeat catalog </w:t>
+      </w:r>
+      <w:r>
+        <w:rPr>
+          <w:rFonts w:ascii="Times New Roman" w:hAnsi="Times New Roman" w:eastAsia="Times New Roman" w:cs="Times New Roman"/>
+          <w:color w:val="3399FF"/>
+        </w:rPr>
+        <w:t xml:space="preserve">(English et al., 2024; dataset English, 2024a)</w:t>
+      </w:r>
+      <w:r>
+        <w:rPr>
+          <w:rFonts w:ascii="Times New Roman" w:hAnsi="Times New Roman" w:eastAsia="Times New Roman" w:cs="Times New Roman"/>
+          <w:color w:val="000000"/>
+        </w:rPr>
+        <w:t xml:space="preserve">. Plant evaluation uses Col-CEN v1.2 </w:t>
+      </w:r>
+      <w:r>
+        <w:rPr>
+          <w:rFonts w:ascii="Times New Roman" w:hAnsi="Times New Roman" w:eastAsia="Times New Roman" w:cs="Times New Roman"/>
+          <w:color w:val="3399FF"/>
+        </w:rPr>
+        <w:t xml:space="preserve">(Naish et al., 2021; dataset Schatzlab, n.d.)</w:t>
+      </w:r>
+      <w:r>
+        <w:rPr>
+          <w:rFonts w:ascii="Times New Roman" w:hAnsi="Times New Roman" w:eastAsia="Times New Roman" w:cs="Times New Roman"/>
+          <w:color w:val="000000"/>
+        </w:rPr>
+        <w:t xml:space="preserve"> and maize Mo17, GenBank assembly GCA_022117705.1 </w:t>
+      </w:r>
+      <w:r>
+        <w:rPr>
+          <w:rFonts w:ascii="Times New Roman" w:hAnsi="Times New Roman" w:eastAsia="Times New Roman" w:cs="Times New Roman"/>
+          <w:color w:val="3399FF"/>
+        </w:rPr>
+        <w:t xml:space="preserve">(Chen et al., 2023; dataset China Agriculture University, n.d.)</w:t>
+      </w:r>
+      <w:r>
+        <w:rPr>
+          <w:rFonts w:ascii="Times New Roman" w:hAnsi="Times New Roman" w:eastAsia="Times New Roman" w:cs="Times New Roman"/>
+          <w:color w:val="000000"/>
+        </w:rPr>
+        <w:t xml:space="preserve">. Human region recovery requires one-base overlap. Reciprocal-overlap and one-to-one sensitivity analyses are provided in the supplement. Catalog precision is not precision against all genomic repeats. Output-period filtering matches the human comparison band, not execution ranges. Historical competitors processed additional sequences; memory measurements mix sampled cgroup peaks and GNU-time maxima. These observations do not establish matched cross-tool speedups. Human operating points and the Arabidopsis catch-all choice were selected using their evaluation truth sets; these are in-sample comparisons, and competitors did not receive an equivalent tuning search. All tables, original identifiers, detailed caveats and source links are retained in the supplement.</w:t>
+      </w:r>
+    </w:p>
+    <w:p>
+      <w:pPr>
+        <w:pStyle w:val="BodyText"/>
+        <w:ind w:firstLine="360"/>
+        <w:jc w:val="left"/>
+      </w:pPr>
+      <w:r>
+        <w:rPr>
+          <w:rFonts w:ascii="Times New Roman" w:hAnsi="Times New Roman" w:eastAsia="Times New Roman" w:cs="Times New Roman"/>
+          <w:color w:val="000000"/>
+        </w:rPr>
+        <w:t xml:space="preserve">Parameter limits, execution configurations and competitor versions are specified for reproducing the benchmark settings (</w:t>
+      </w:r>
+      <w:r>
+        <w:rPr>
+          <w:rFonts w:ascii="Times New Roman" w:hAnsi="Times New Roman" w:eastAsia="Times New Roman" w:cs="Times New Roman"/>
+          <w:color w:val="FF0000"/>
+        </w:rPr>
+        <w:t xml:space="preserve">Supplementary Tables S13-S15</w:t>
+      </w:r>
+      <w:r>
+        <w:rPr>
+          <w:rFonts w:ascii="Times New Roman" w:hAnsi="Times New Roman" w:eastAsia="Times New Roman" w:cs="Times New Roman"/>
+          <w:color w:val="000000"/>
+        </w:rPr>
+        <w:t xml:space="preserve">).</w:t>
       </w:r>
     </w:p>
     <w:bookmarkEnd w:id="22"/>
@@ -165,64 +436,395 @@
     <w:p>
       <w:pPr>
         <w:pStyle w:val="Heading2"/>
-      </w:pPr>
-      <w:r>
+        <w:ind w:firstLine="0"/>
+      </w:pPr>
+      <w:r>
+        <w:rPr>
+          <w:rFonts w:ascii="Times New Roman" w:hAnsi="Times New Roman" w:eastAsia="Times New Roman" w:cs="Times New Roman"/>
+          <w:b w:val="1"/>
+          <w:bCs w:val="1"/>
+          <w:color w:val="000000"/>
+        </w:rPr>
         <w:t xml:space="preserve">3 Results and limitations</w:t>
       </w:r>
     </w:p>
     <w:p>
       <w:pPr>
         <w:pStyle w:val="FirstParagraph"/>
-      </w:pPr>
-      <w:r>
+        <w:ind w:firstLine="0"/>
+        <w:jc w:val="left"/>
+      </w:pPr>
+      <w:r>
+        <w:rPr>
+          <w:rFonts w:ascii="Times New Roman" w:hAnsi="Times New Roman" w:eastAsia="Times New Roman" w:cs="Times New Roman"/>
+          <w:color w:val="000000"/>
+        </w:rPr>
         <w:t xml:space="preserve">Three paired four-worker human runs at execution commit</w:t>
       </w:r>
       <w:r>
+        <w:rPr>
+          <w:rFonts w:ascii="Times New Roman" w:hAnsi="Times New Roman" w:eastAsia="Times New Roman" w:cs="Times New Roman"/>
+          <w:color w:val="000000"/>
+        </w:rPr>
         <w:t xml:space="preserve"> </w:t>
       </w:r>
       <w:r>
         <w:rPr>
           <w:rStyle w:val="VerbatimChar"/>
+          <w:rFonts w:ascii="Times New Roman" w:hAnsi="Times New Roman" w:eastAsia="Times New Roman" w:cs="Times New Roman"/>
+          <w:color w:val="000000"/>
         </w:rPr>
         <w:t xml:space="preserve">0363d8b</w:t>
       </w:r>
       <w:r>
+        <w:rPr>
+          <w:rFonts w:ascii="Times New Roman" w:hAnsi="Times New Roman" w:eastAsia="Times New Roman" w:cs="Times New Roman"/>
+          <w:color w:val="000000"/>
+        </w:rPr>
         <w:t xml:space="preserve"> </w:t>
       </w:r>
       <w:r>
-        <w:t xml:space="preserve">changed only the maximum period, from 100 to 2,000 bp. Runtime ratios were 1.77–1.82, with a mean of 1.79 (Fig. 1). Two replicates shared a node. This is a sublinear response over two measured ceilings, not an asymptotic bound. The earlier 1.30–1.41 estimate is superseded: its narrow arm still searched and discarded long-period candidates. A historical Tier-2/3 lookup substitution changed Arabidopsis runtime by 5.56% without changing output, but retained the index; it was not an index-free pipeline ablation.</w:t>
+        <w:rPr>
+          <w:rFonts w:ascii="Times New Roman" w:hAnsi="Times New Roman" w:eastAsia="Times New Roman" w:cs="Times New Roman"/>
+          <w:color w:val="000000"/>
+        </w:rPr>
+        <w:t xml:space="preserve">changed only the maximum period, from 100 to 2,000 bp. Runtime ratios were 1.77-1.82, with a mean of 1.79 (</w:t>
+      </w:r>
+      <w:r>
+        <w:rPr>
+          <w:rFonts w:ascii="Times New Roman" w:hAnsi="Times New Roman" w:eastAsia="Times New Roman" w:cs="Times New Roman"/>
+          <w:color w:val="FF0000"/>
+        </w:rPr>
+        <w:t xml:space="preserve">Fig. 1</w:t>
+      </w:r>
+      <w:r>
+        <w:rPr>
+          <w:rFonts w:ascii="Times New Roman" w:hAnsi="Times New Roman" w:eastAsia="Times New Roman" w:cs="Times New Roman"/>
+          <w:color w:val="000000"/>
+        </w:rPr>
+        <w:t xml:space="preserve">; </w:t>
+      </w:r>
+      <w:r>
+        <w:rPr>
+          <w:rFonts w:ascii="Times New Roman" w:hAnsi="Times New Roman" w:eastAsia="Times New Roman" w:cs="Times New Roman"/>
+          <w:color w:val="FF0000"/>
+        </w:rPr>
+        <w:t xml:space="preserve">Supplementary Fig. S1</w:t>
+      </w:r>
+      <w:r>
+        <w:rPr>
+          <w:rFonts w:ascii="Times New Roman" w:hAnsi="Times New Roman" w:eastAsia="Times New Roman" w:cs="Times New Roman"/>
+          <w:color w:val="000000"/>
+        </w:rPr>
+        <w:t xml:space="preserve">). Two replicates shared a node. This is a sublinear response over two measured ceilings, not an asymptotic bound. The earlier 1.30-1.41 estimate is superseded: its narrow arm still searched and discarded long-period candidates. A historical Tier-2/3 lookup substitution changed Arabidopsis runtime by 5.56% without changing output, but retained the index; it was not an index-free pipeline ablation.</w:t>
       </w:r>
     </w:p>
     <w:p>
       <w:pPr>
         <w:pStyle w:val="BodyText"/>
-      </w:pPr>
-      <w:r>
-        <w:t xml:space="preserve">At the shared ≤100 bp output band, ULTRA had 81.62% region recall and BWTandem 78.87%; ULTRA remained ahead under both reciprocal-overlap rules (Fig. 2; Supplementary Table 1b). BWTandem’s permissive native-period-100 setting reached 81.60% recall at 48.44% precision, versus ULTRA’s 53.66% precision. BWTandem’s full-range two-worker run required 12.65 h and 28.08 GiB, distinct from the four-worker paired measurements. No claim of superior shared-range accuracy follows.</w:t>
+        <w:ind w:firstLine="360"/>
+        <w:jc w:val="left"/>
+      </w:pPr>
+      <w:r>
+        <w:rPr>
+          <w:rFonts w:ascii="Times New Roman" w:hAnsi="Times New Roman" w:eastAsia="Times New Roman" w:cs="Times New Roman"/>
+          <w:color w:val="000000"/>
+        </w:rPr>
+        <w:t xml:space="preserve">At the shared ≤100 bp output band, ULTRA had 81.62% region recall and BWTandem 78.87%; ULTRA remained ahead under both reciprocal-overlap rules (</w:t>
+      </w:r>
+      <w:r>
+        <w:rPr>
+          <w:rFonts w:ascii="Times New Roman" w:hAnsi="Times New Roman" w:eastAsia="Times New Roman" w:cs="Times New Roman"/>
+          <w:color w:val="FF0000"/>
+        </w:rPr>
+        <w:t xml:space="preserve">Fig. 2</w:t>
+      </w:r>
+      <w:r>
+        <w:rPr>
+          <w:rFonts w:ascii="Times New Roman" w:hAnsi="Times New Roman" w:eastAsia="Times New Roman" w:cs="Times New Roman"/>
+          <w:color w:val="000000"/>
+        </w:rPr>
+        <w:t xml:space="preserve">; </w:t>
+      </w:r>
+      <w:r>
+        <w:rPr>
+          <w:rFonts w:ascii="Times New Roman" w:hAnsi="Times New Roman" w:eastAsia="Times New Roman" w:cs="Times New Roman"/>
+          <w:color w:val="FF0000"/>
+        </w:rPr>
+        <w:t xml:space="preserve">Supplementary Fig. S4</w:t>
+      </w:r>
+      <w:r>
+        <w:rPr>
+          <w:rFonts w:ascii="Times New Roman" w:hAnsi="Times New Roman" w:eastAsia="Times New Roman" w:cs="Times New Roman"/>
+          <w:color w:val="000000"/>
+        </w:rPr>
+        <w:t xml:space="preserve">; </w:t>
+      </w:r>
+      <w:r>
+        <w:rPr>
+          <w:rFonts w:ascii="Times New Roman" w:hAnsi="Times New Roman" w:eastAsia="Times New Roman" w:cs="Times New Roman"/>
+          <w:color w:val="FF0000"/>
+        </w:rPr>
+        <w:t xml:space="preserve">Supplementary Table S2</w:t>
+      </w:r>
+      <w:r>
+        <w:rPr>
+          <w:rFonts w:ascii="Times New Roman" w:hAnsi="Times New Roman" w:eastAsia="Times New Roman" w:cs="Times New Roman"/>
+          <w:color w:val="000000"/>
+        </w:rPr>
+        <w:t xml:space="preserve">). BWTandem's permissive native-period-100 setting reached 81.60% recall at 48.44% precision, versus ULTRA's 53.66% precision. BWTandem's full-range two-worker run required 12.65 h and 28.08 GiB, distinct from the four-worker paired measurements. No claim of superior shared-range accuracy follows.</w:t>
       </w:r>
     </w:p>
     <w:p>
       <w:pPr>
         <w:pStyle w:val="BodyText"/>
-      </w:pPr>
-      <w:r>
+        <w:ind w:firstLine="360"/>
+        <w:jc w:val="left"/>
+      </w:pPr>
+      <w:r>
+        <w:rPr>
+          <w:rFonts w:ascii="Times New Roman" w:hAnsi="Times New Roman" w:eastAsia="Times New Roman" w:cs="Times New Roman"/>
+          <w:color w:val="000000"/>
+        </w:rPr>
         <w:t xml:space="preserve">A blinded, single-reader audit of 400 stratified BWTandem calls overlapping neither adotto nor TRF, ULTRA, tantan or TRASH returned 4 supported, 346 unsupported and 50 unsure. Equal sampling by period stratum is not a population-weighted estimate. Unmatched-call counts therefore do not demonstrate additional true repeats. Images, rendering settings and a separate reader attestation are missing from the deposit; the verdict records survive.</w:t>
       </w:r>
     </w:p>
     <w:p>
       <w:pPr>
         <w:pStyle w:val="BodyText"/>
-      </w:pPr>
-      <w:r>
-        <w:t xml:space="preserve">On Col-CEN, BWTandem overlapped 99.72% of conserved CEN180 reference monomers by at least one base without a call-period filter, falling to 94.68% when calls were restricted to 150–400 bp (Supplementary Table 2 and Section 3.2). tantan’s 500 bp-window rerun recovered 99.24% with higher base-pair precision and lower observed cost, although its shared-node timing and narrower search range were not matched to BWTandem. On maize CentC, AniAnn’s covered 81.42%, versus BWTandem’s 58.55%, with coarser boundaries. BWTandem’s period-filtered coverage losses were 15.59, 33.01 and 17.84 percentage points for knob180, TR-1 and CentC. Detection and correct period assignment are different tasks.</w:t>
+        <w:ind w:firstLine="360"/>
+        <w:jc w:val="left"/>
+      </w:pPr>
+      <w:r>
+        <w:rPr>
+          <w:rFonts w:ascii="Times New Roman" w:hAnsi="Times New Roman" w:eastAsia="Times New Roman" w:cs="Times New Roman"/>
+          <w:color w:val="000000"/>
+        </w:rPr>
+        <w:t xml:space="preserve">On Col-CEN, BWTandem overlapped 99.72% of conserved CEN180 reference monomers by at least one base without a call-period filter, falling to 94.68% when calls were restricted to 150-400 bp (</w:t>
+      </w:r>
+      <w:r>
+        <w:rPr>
+          <w:rFonts w:ascii="Times New Roman" w:hAnsi="Times New Roman" w:eastAsia="Times New Roman" w:cs="Times New Roman"/>
+          <w:color w:val="FF0000"/>
+        </w:rPr>
+        <w:t xml:space="preserve">Supplementary Table S6</w:t>
+      </w:r>
+      <w:r>
+        <w:rPr>
+          <w:rFonts w:ascii="Times New Roman" w:hAnsi="Times New Roman" w:eastAsia="Times New Roman" w:cs="Times New Roman"/>
+          <w:color w:val="000000"/>
+        </w:rPr>
+        <w:t xml:space="preserve"> and Section 3.2). tantan's 500 bp-window rerun recovered 99.24% with higher base-pair precision and lower observed cost, although its shared-node timing and narrower search range were not matched to BWTandem. On maize CentC, AniAnn's covered 81.42%, versus BWTandem's 58.55%, with coarser boundaries. BWTandem's period-filtered coverage losses were 15.59, 33.01 and 17.84 percentage points for knob180, TR-1 and CentC. Detection and correct period assignment are different tasks.</w:t>
       </w:r>
     </w:p>
     <w:p>
       <w:pPr>
         <w:pStyle w:val="BodyText"/>
-      </w:pPr>
-      <w:r>
+        <w:ind w:firstLine="360"/>
+        <w:jc w:val="left"/>
+      </w:pPr>
+      <w:r>
+        <w:rPr>
+          <w:rFonts w:ascii="Times New Roman" w:hAnsi="Times New Roman" w:eastAsia="Times New Roman" w:cs="Times New Roman"/>
+          <w:color w:val="000000"/>
+        </w:rPr>
         <w:t xml:space="preserve">Fragmentation, over-calling, missing historical provenance and a still-unresolved layout-dependent native regression test limit deployment claims. The benchmark does not validate all reported motif structures or establish broad generalization to unseen genomes. BWTandem offers wide-range candidate records for downstream validation, not a replacement for that validation.</w:t>
+      </w:r>
+    </w:p>
+    <w:p>
+      <w:pPr>
+        <w:pStyle w:val="BodyText"/>
+        <w:ind w:firstLine="360"/>
+        <w:jc w:val="left"/>
+      </w:pPr>
+      <w:r>
+        <w:rPr>
+          <w:rFonts w:ascii="Times New Roman" w:hAnsi="Times New Roman" w:eastAsia="Times New Roman" w:cs="Times New Roman"/>
+          <w:color w:val="000000"/>
+        </w:rPr>
+        <w:t xml:space="preserve">Full-range human results, the shared ≤100 bp comparison and the 101-2,000 bp stratum describe different output ranges (</w:t>
+      </w:r>
+      <w:r>
+        <w:rPr>
+          <w:rFonts w:ascii="Times New Roman" w:hAnsi="Times New Roman" w:eastAsia="Times New Roman" w:cs="Times New Roman"/>
+          <w:color w:val="FF0000"/>
+        </w:rPr>
+        <w:t xml:space="preserve">Supplementary Tables S1-S3</w:t>
+      </w:r>
+      <w:r>
+        <w:rPr>
+          <w:rFonts w:ascii="Times New Roman" w:hAnsi="Times New Roman" w:eastAsia="Times New Roman" w:cs="Times New Roman"/>
+          <w:color w:val="000000"/>
+        </w:rPr>
+        <w:t xml:space="preserve">). Native-period-100 operating points show the recall-precision trade-off, while cross-caller support rates depend on the corroboration rule (</w:t>
+      </w:r>
+      <w:r>
+        <w:rPr>
+          <w:rFonts w:ascii="Times New Roman" w:hAnsi="Times New Roman" w:eastAsia="Times New Roman" w:cs="Times New Roman"/>
+          <w:color w:val="FF0000"/>
+        </w:rPr>
+        <w:t xml:space="preserve">Supplementary Tables S4 and S5</w:t>
+      </w:r>
+      <w:r>
+        <w:rPr>
+          <w:rFonts w:ascii="Times New Roman" w:hAnsi="Times New Roman" w:eastAsia="Times New Roman" w:cs="Times New Roman"/>
+          <w:color w:val="000000"/>
+        </w:rPr>
+        <w:t xml:space="preserve">). The ULTRA, BWTandem and tantan recall ordering persists across chromosome-subset checks of post-filtered full-range output (</w:t>
+      </w:r>
+      <w:r>
+        <w:rPr>
+          <w:rFonts w:ascii="Times New Roman" w:hAnsi="Times New Roman" w:eastAsia="Times New Roman" w:cs="Times New Roman"/>
+          <w:color w:val="FF0000"/>
+        </w:rPr>
+        <w:t xml:space="preserve">Supplementary Fig. S2</w:t>
+      </w:r>
+      <w:r>
+        <w:rPr>
+          <w:rFonts w:ascii="Times New Roman" w:hAnsi="Times New Roman" w:eastAsia="Times New Roman" w:cs="Times New Roman"/>
+          <w:color w:val="000000"/>
+        </w:rPr>
+        <w:t xml:space="preserve">). Unmatched and shared calls differ in length and motif entropy; these properties do not validate unmatched calls (</w:t>
+      </w:r>
+      <w:r>
+        <w:rPr>
+          <w:rFonts w:ascii="Times New Roman" w:hAnsi="Times New Roman" w:eastAsia="Times New Roman" w:cs="Times New Roman"/>
+          <w:color w:val="FF0000"/>
+        </w:rPr>
+        <w:t xml:space="preserve">Supplementary Table S16</w:t>
+      </w:r>
+      <w:r>
+        <w:rPr>
+          <w:rFonts w:ascii="Times New Roman" w:hAnsi="Times New Roman" w:eastAsia="Times New Roman" w:cs="Times New Roman"/>
+          <w:color w:val="000000"/>
+        </w:rPr>
+        <w:t xml:space="preserve">). Strict one-to-one scores depend on whether matching uses padded regions or annotation coordinates (</w:t>
+      </w:r>
+      <w:r>
+        <w:rPr>
+          <w:rFonts w:ascii="Times New Roman" w:hAnsi="Times New Roman" w:eastAsia="Times New Roman" w:cs="Times New Roman"/>
+          <w:color w:val="FF0000"/>
+        </w:rPr>
+        <w:t xml:space="preserve">Supplementary Tables S17 and S18</w:t>
+      </w:r>
+      <w:r>
+        <w:rPr>
+          <w:rFonts w:ascii="Times New Roman" w:hAnsi="Times New Roman" w:eastAsia="Times New Roman" w:cs="Times New Roman"/>
+          <w:color w:val="000000"/>
+        </w:rPr>
+        <w:t xml:space="preserve">).</w:t>
+      </w:r>
+    </w:p>
+    <w:p>
+      <w:pPr>
+        <w:pStyle w:val="BodyText"/>
+        <w:ind w:firstLine="360"/>
+        <w:jc w:val="left"/>
+      </w:pPr>
+      <w:r>
+        <w:rPr>
+          <w:rFonts w:ascii="Times New Roman" w:hAnsi="Times New Roman" w:eastAsia="Times New Roman" w:cs="Times New Roman"/>
+          <w:color w:val="000000"/>
+        </w:rPr>
+        <w:t xml:space="preserve">The single-reader audit supported few calls absent from both the catalog and the original comparators (</w:t>
+      </w:r>
+      <w:r>
+        <w:rPr>
+          <w:rFonts w:ascii="Times New Roman" w:hAnsi="Times New Roman" w:eastAsia="Times New Roman" w:cs="Times New Roman"/>
+          <w:color w:val="FF0000"/>
+        </w:rPr>
+        <w:t xml:space="preserve">Supplementary Fig. S3</w:t>
+      </w:r>
+      <w:r>
+        <w:rPr>
+          <w:rFonts w:ascii="Times New Roman" w:hAnsi="Times New Roman" w:eastAsia="Times New Roman" w:cs="Times New Roman"/>
+          <w:color w:val="000000"/>
+        </w:rPr>
+        <w:t xml:space="preserve">). Maize microsatellite counts depend on whether the same period rule is applied to every tool (</w:t>
+      </w:r>
+      <w:r>
+        <w:rPr>
+          <w:rFonts w:ascii="Times New Roman" w:hAnsi="Times New Roman" w:eastAsia="Times New Roman" w:cs="Times New Roman"/>
+          <w:color w:val="FF0000"/>
+        </w:rPr>
+        <w:t xml:space="preserve">Supplementary Tables S7 and S8</w:t>
+      </w:r>
+      <w:r>
+        <w:rPr>
+          <w:rFonts w:ascii="Times New Roman" w:hAnsi="Times New Roman" w:eastAsia="Times New Roman" w:cs="Times New Roman"/>
+          <w:color w:val="000000"/>
+        </w:rPr>
+        <w:t xml:space="preserve">). Satellite coverage, boundary offsets and filtering losses differ across knob180, TR-1 and CentC (</w:t>
+      </w:r>
+      <w:r>
+        <w:rPr>
+          <w:rFonts w:ascii="Times New Roman" w:hAnsi="Times New Roman" w:eastAsia="Times New Roman" w:cs="Times New Roman"/>
+          <w:color w:val="FF0000"/>
+        </w:rPr>
+        <w:t xml:space="preserve">Supplementary Tables S9-S12</w:t>
+      </w:r>
+      <w:r>
+        <w:rPr>
+          <w:rFonts w:ascii="Times New Roman" w:hAnsi="Times New Roman" w:eastAsia="Times New Roman" w:cs="Times New Roman"/>
+          <w:color w:val="000000"/>
+        </w:rPr>
+        <w:t xml:space="preserve">; </w:t>
+      </w:r>
+      <w:r>
+        <w:rPr>
+          <w:rFonts w:ascii="Times New Roman" w:hAnsi="Times New Roman" w:eastAsia="Times New Roman" w:cs="Times New Roman"/>
+          <w:color w:val="FF0000"/>
+        </w:rPr>
+        <w:t xml:space="preserve">Supplementary Fig. S5</w:t>
+      </w:r>
+      <w:r>
+        <w:rPr>
+          <w:rFonts w:ascii="Times New Roman" w:hAnsi="Times New Roman" w:eastAsia="Times New Roman" w:cs="Times New Roman"/>
+          <w:color w:val="000000"/>
+        </w:rPr>
+        <w:t xml:space="preserve">). Coordinate-only merging provides a separate boundary and fragmentation diagnostic (</w:t>
+      </w:r>
+      <w:r>
+        <w:rPr>
+          <w:rFonts w:ascii="Times New Roman" w:hAnsi="Times New Roman" w:eastAsia="Times New Roman" w:cs="Times New Roman"/>
+          <w:color w:val="FF0000"/>
+        </w:rPr>
+        <w:t xml:space="preserve">Supplementary Fig. S6</w:t>
+      </w:r>
+      <w:r>
+        <w:rPr>
+          <w:rFonts w:ascii="Times New Roman" w:hAnsi="Times New Roman" w:eastAsia="Times New Roman" w:cs="Times New Roman"/>
+          <w:color w:val="000000"/>
+        </w:rPr>
+        <w:t xml:space="preserve">). Selected k-mer self-similarity and dot-plot examples illustrate repeat structure without independently validating the reported motifs (</w:t>
+      </w:r>
+      <w:r>
+        <w:rPr>
+          <w:rFonts w:ascii="Times New Roman" w:hAnsi="Times New Roman" w:eastAsia="Times New Roman" w:cs="Times New Roman"/>
+          <w:color w:val="FF0000"/>
+        </w:rPr>
+        <w:t xml:space="preserve">Supplementary Fig. S7</w:t>
+      </w:r>
+      <w:r>
+        <w:rPr>
+          <w:rFonts w:ascii="Times New Roman" w:hAnsi="Times New Roman" w:eastAsia="Times New Roman" w:cs="Times New Roman"/>
+          <w:color w:val="000000"/>
+        </w:rPr>
+        <w:t xml:space="preserve">).</w:t>
+      </w:r>
+    </w:p>
+    <w:p>
+      <w:pPr>
+        <w:pStyle w:val="BodyText"/>
+        <w:ind w:firstLine="360"/>
+        <w:jc w:val="left"/>
+      </w:pPr>
+      <w:r>
+        <w:rPr>
+          <w:rFonts w:ascii="Times New Roman" w:hAnsi="Times New Roman" w:eastAsia="Times New Roman" w:cs="Times New Roman"/>
+          <w:color w:val="000000"/>
+        </w:rPr>
+        <w:t xml:space="preserve">In the full-range identity sweep, region recall/precision were 62.59%/54.72% with the catch-all pass disabled, 71.36%/53.42% at identity 0.80, 71.53%/53.35% at 0.76, 80.53%/50.50% at 0.72 and 81.46%/48.92% at 0.68. These in-sample results informed the operating-point selection (Supplementary Section S2).</w:t>
       </w:r>
     </w:p>
     <w:bookmarkEnd w:id="23"/>
@@ -230,31 +832,58 @@
     <w:p>
       <w:pPr>
         <w:pStyle w:val="Heading2"/>
-      </w:pPr>
-      <w:r>
+        <w:ind w:firstLine="0"/>
+      </w:pPr>
+      <w:r>
+        <w:rPr>
+          <w:rFonts w:ascii="Times New Roman" w:hAnsi="Times New Roman" w:eastAsia="Times New Roman" w:cs="Times New Roman"/>
+          <w:b w:val="1"/>
+          <w:bCs w:val="1"/>
+          <w:color w:val="000000"/>
+        </w:rPr>
         <w:t xml:space="preserve">Data and code availability</w:t>
       </w:r>
     </w:p>
     <w:p>
       <w:pPr>
         <w:pStyle w:val="FirstParagraph"/>
-      </w:pPr>
-      <w:r>
+        <w:ind w:firstLine="0"/>
+        <w:jc w:val="left"/>
+      </w:pPr>
+      <w:r>
+        <w:rPr>
+          <w:rFonts w:ascii="Times New Roman" w:hAnsi="Times New Roman" w:eastAsia="Times New Roman" w:cs="Times New Roman"/>
+          <w:color w:val="000000"/>
+        </w:rPr>
         <w:t xml:space="preserve">Source code, scorers, regenerated BWTandem BEDs and hashed evidence are in the repository linked above. Execution commit</w:t>
       </w:r>
       <w:r>
+        <w:rPr>
+          <w:rFonts w:ascii="Times New Roman" w:hAnsi="Times New Roman" w:eastAsia="Times New Roman" w:cs="Times New Roman"/>
+          <w:color w:val="000000"/>
+        </w:rPr>
         <w:t xml:space="preserve"> </w:t>
       </w:r>
       <w:r>
         <w:rPr>
           <w:rStyle w:val="VerbatimChar"/>
+          <w:rFonts w:ascii="Times New Roman" w:hAnsi="Times New Roman" w:eastAsia="Times New Roman" w:cs="Times New Roman"/>
+          <w:color w:val="000000"/>
         </w:rPr>
         <w:t xml:space="preserve">0363d8b</w:t>
       </w:r>
       <w:r>
+        <w:rPr>
+          <w:rFonts w:ascii="Times New Roman" w:hAnsi="Times New Roman" w:eastAsia="Times New Roman" w:cs="Times New Roman"/>
+          <w:color w:val="000000"/>
+        </w:rPr>
         <w:t xml:space="preserve"> </w:t>
       </w:r>
       <w:r>
+        <w:rPr>
+          <w:rFonts w:ascii="Times New Roman" w:hAnsi="Times New Roman" w:eastAsia="Times New Roman" w:cs="Times New Roman"/>
+          <w:color w:val="000000"/>
+        </w:rPr>
         <w:t xml:space="preserve">identifies regenerated benchmark code; the later submission release does not constitute a benchmark rerun. Competitor BEDs and several external inputs are not deposited. The supplement preserves the full evidence/provenance limitations and corrected strict one-to-one panels.</w:t>
       </w:r>
     </w:p>
@@ -263,16 +892,29 @@
     <w:p>
       <w:pPr>
         <w:pStyle w:val="Heading2"/>
-      </w:pPr>
-      <w:r>
+        <w:ind w:firstLine="0"/>
+      </w:pPr>
+      <w:r>
+        <w:rPr>
+          <w:rFonts w:ascii="Times New Roman" w:hAnsi="Times New Roman" w:eastAsia="Times New Roman" w:cs="Times New Roman"/>
+          <w:b w:val="1"/>
+          <w:bCs w:val="1"/>
+          <w:color w:val="000000"/>
+        </w:rPr>
         <w:t xml:space="preserve">Acknowledgments</w:t>
       </w:r>
     </w:p>
     <w:p>
       <w:pPr>
         <w:pStyle w:val="FirstParagraph"/>
-      </w:pPr>
-      <w:r>
+        <w:ind w:firstLine="0"/>
+        <w:jc w:val="left"/>
+      </w:pPr>
+      <w:r>
+        <w:rPr>
+          <w:rFonts w:ascii="Times New Roman" w:hAnsi="Times New Roman" w:eastAsia="Times New Roman" w:cs="Times New Roman"/>
+          <w:color w:val="000000"/>
+        </w:rPr>
         <w:t xml:space="preserve">The authors acknowledge Research &amp; Innovation and the Cyberinfrastructure Team in the Office of Information Technology at the University of Nevada, Reno for access to computing resources.</w:t>
       </w:r>
     </w:p>
@@ -281,187 +923,360 @@
     <w:p>
       <w:pPr>
         <w:pStyle w:val="Heading2"/>
-      </w:pPr>
-      <w:r>
+        <w:ind w:firstLine="0"/>
+      </w:pPr>
+      <w:r>
+        <w:rPr>
+          <w:rFonts w:ascii="Times New Roman" w:hAnsi="Times New Roman" w:eastAsia="Times New Roman" w:cs="Times New Roman"/>
+          <w:b w:val="1"/>
+          <w:bCs w:val="1"/>
+          <w:color w:val="000000"/>
+        </w:rPr>
         <w:t xml:space="preserve">References</w:t>
       </w:r>
     </w:p>
     <w:p>
       <w:pPr>
         <w:pStyle w:val="FirstParagraph"/>
-      </w:pPr>
-      <w:r>
+        <w:ind w:firstLine="0"/>
+        <w:jc w:val="left"/>
+      </w:pPr>
+      <w:r>
+        <w:rPr>
+          <w:rFonts w:ascii="Times New Roman" w:hAnsi="Times New Roman" w:eastAsia="Times New Roman" w:cs="Times New Roman"/>
+          <w:color w:val="000000"/>
+        </w:rPr>
         <w:t xml:space="preserve">Benson G. (1999) Tandem repeats finder: a program to analyze DNA sequences.</w:t>
       </w:r>
       <w:r>
+        <w:rPr>
+          <w:rFonts w:ascii="Times New Roman" w:hAnsi="Times New Roman" w:eastAsia="Times New Roman" w:cs="Times New Roman"/>
+          <w:color w:val="000000"/>
+        </w:rPr>
         <w:t xml:space="preserve"> </w:t>
       </w:r>
       <w:r>
         <w:rPr>
+          <w:rFonts w:ascii="Times New Roman" w:hAnsi="Times New Roman" w:eastAsia="Times New Roman" w:cs="Times New Roman"/>
           <w:iCs/>
           <w:i/>
+          <w:color w:val="000000"/>
         </w:rPr>
         <w:t xml:space="preserve">Nucleic Acids Res.</w:t>
       </w:r>
       <w:r>
-        <w:t xml:space="preserve">, 27, 573–580.</w:t>
+        <w:rPr>
+          <w:rFonts w:ascii="Times New Roman" w:hAnsi="Times New Roman" w:eastAsia="Times New Roman" w:cs="Times New Roman"/>
+          <w:color w:val="000000"/>
+        </w:rPr>
+        <w:t xml:space="preserve">, 27, 573-580.</w:t>
       </w:r>
     </w:p>
     <w:p>
       <w:pPr>
         <w:pStyle w:val="BodyText"/>
-      </w:pPr>
-      <w:r>
-        <w:t xml:space="preserve">Chen J. et al. (2023) A complete telomere-to-telomere assembly of the maize genome.</w:t>
-      </w:r>
-      <w:r>
+        <w:ind w:firstLine="360"/>
+        <w:jc w:val="left"/>
+      </w:pPr>
+      <w:r>
+        <w:rPr>
+          <w:rFonts w:ascii="Times New Roman" w:hAnsi="Times New Roman" w:eastAsia="Times New Roman" w:cs="Times New Roman"/>
+          <w:color w:val="000000"/>
+        </w:rPr>
+        <w:t xml:space="preserve">Chen J. et al. (2023) A complete telomere-to-telomere assembly of the maize genome.</w:t>
+      </w:r>
+      <w:r>
+        <w:rPr>
+          <w:rFonts w:ascii="Times New Roman" w:hAnsi="Times New Roman" w:eastAsia="Times New Roman" w:cs="Times New Roman"/>
+          <w:color w:val="000000"/>
+        </w:rPr>
         <w:t xml:space="preserve"> </w:t>
       </w:r>
       <w:r>
         <w:rPr>
+          <w:rFonts w:ascii="Times New Roman" w:hAnsi="Times New Roman" w:eastAsia="Times New Roman" w:cs="Times New Roman"/>
           <w:iCs/>
           <w:i/>
+          <w:color w:val="000000"/>
         </w:rPr>
         <w:t xml:space="preserve">Nat. Genet.</w:t>
       </w:r>
       <w:r>
-        <w:t xml:space="preserve">, 55, 1221–1231.</w:t>
+        <w:rPr>
+          <w:rFonts w:ascii="Times New Roman" w:hAnsi="Times New Roman" w:eastAsia="Times New Roman" w:cs="Times New Roman"/>
+          <w:color w:val="000000"/>
+        </w:rPr>
+        <w:t xml:space="preserve">, 55, 1221-1231.</w:t>
       </w:r>
     </w:p>
     <w:p>
       <w:pPr>
         <w:pStyle w:val="BodyText"/>
-      </w:pPr>
-      <w:r>
-        <w:t xml:space="preserve">China Agriculture University (n.d.) Zm-Mo17-REFERENCE-CAU-T2T-assembly assembly for Zea mays (dataset). GenBank/ENA assembly accession GCA_022117705.1. https://www.ebi.ac.uk/ena/browser/view/GCA_022117705.1</w:t>
-      </w:r>
-    </w:p>
-    <w:p>
-      <w:pPr>
-        <w:pStyle w:val="BodyText"/>
-      </w:pPr>
-      <w:r>
-        <w:t xml:space="preserve">English A.C. et al. (2024) Analysis and benchmarking of small and large genomic variants across tandem repeats.</w:t>
-      </w:r>
-      <w:r>
+        <w:ind w:firstLine="360"/>
+        <w:jc w:val="left"/>
+      </w:pPr>
+      <w:r>
+        <w:rPr>
+          <w:rFonts w:ascii="Times New Roman" w:hAnsi="Times New Roman" w:eastAsia="Times New Roman" w:cs="Times New Roman"/>
+          <w:color w:val="000000"/>
+        </w:rPr>
+        <w:t xml:space="preserve">China Agriculture University (n.d.) Zm-Mo17-REFERENCE-CAU-T2T-assembly assembly for</w:t>
+      </w:r>
+      <w:r>
+        <w:rPr>
+          <w:rFonts w:ascii="Times New Roman" w:hAnsi="Times New Roman" w:eastAsia="Times New Roman" w:cs="Times New Roman"/>
+          <w:color w:val="000000"/>
+        </w:rPr>
         <w:t xml:space="preserve"> </w:t>
       </w:r>
       <w:r>
         <w:rPr>
+          <w:rFonts w:ascii="Times New Roman" w:hAnsi="Times New Roman" w:eastAsia="Times New Roman" w:cs="Times New Roman"/>
           <w:iCs/>
           <w:i/>
-        </w:rPr>
-        <w:t xml:space="preserve">Nat. Biotechnol.</w:t>
-      </w:r>
-      <w:r>
-        <w:t xml:space="preserve">, published online 26 April 2024; 43, 431–442 (2025).</w:t>
+          <w:color w:val="000000"/>
+        </w:rPr>
+        <w:t xml:space="preserve">Zea mays</w:t>
+      </w:r>
+      <w:r>
+        <w:rPr>
+          <w:rFonts w:ascii="Times New Roman" w:hAnsi="Times New Roman" w:eastAsia="Times New Roman" w:cs="Times New Roman"/>
+          <w:color w:val="000000"/>
+        </w:rPr>
+        <w:t xml:space="preserve"> </w:t>
+      </w:r>
+      <w:r>
+        <w:rPr>
+          <w:rFonts w:ascii="Times New Roman" w:hAnsi="Times New Roman" w:eastAsia="Times New Roman" w:cs="Times New Roman"/>
+          <w:color w:val="000000"/>
+        </w:rPr>
+        <w:t xml:space="preserve">(dataset). GenBank/ENA assembly accession GCA_022117705.1. https://www.ebi.ac.uk/ena/browser/view/GCA_022117705.1</w:t>
       </w:r>
     </w:p>
     <w:p>
       <w:pPr>
         <w:pStyle w:val="BodyText"/>
-      </w:pPr>
-      <w:r>
-        <w:t xml:space="preserve">English A. (2024a) Project Adotto Tandem-Repeat Regions and Annotations, v1.2.1 (dataset). Zenodo. https://doi.org/10.5281/zenodo.13987414</w:t>
-      </w:r>
-    </w:p>
-    <w:p>
-      <w:pPr>
-        <w:pStyle w:val="BodyText"/>
-      </w:pPr>
-      <w:r>
-        <w:t xml:space="preserve">Genome Reference Consortium (2013) GRCh38 human reference genome assembly (dataset). GenBank assembly accession GCA_000001405.15. https://www.ncbi.nlm.nih.gov/datasets/genome/GCA_000001405.15/</w:t>
-      </w:r>
-    </w:p>
-    <w:p>
-      <w:pPr>
-        <w:pStyle w:val="BodyText"/>
-      </w:pPr>
-      <w:r>
-        <w:t xml:space="preserve">Li H. and Li B. (2026) Finding low-complexity DNA sequences with longdust.</w:t>
-      </w:r>
-      <w:r>
+        <w:ind w:firstLine="360"/>
+        <w:jc w:val="left"/>
+      </w:pPr>
+      <w:r>
+        <w:rPr>
+          <w:rFonts w:ascii="Times New Roman" w:hAnsi="Times New Roman" w:eastAsia="Times New Roman" w:cs="Times New Roman"/>
+          <w:color w:val="000000"/>
+        </w:rPr>
+        <w:t xml:space="preserve">English A.C. et al. (2024) Analysis and benchmarking of small and large genomic variants across tandem repeats.</w:t>
+      </w:r>
+      <w:r>
+        <w:rPr>
+          <w:rFonts w:ascii="Times New Roman" w:hAnsi="Times New Roman" w:eastAsia="Times New Roman" w:cs="Times New Roman"/>
+          <w:color w:val="000000"/>
+        </w:rPr>
         <w:t xml:space="preserve"> </w:t>
       </w:r>
       <w:r>
         <w:rPr>
+          <w:rFonts w:ascii="Times New Roman" w:hAnsi="Times New Roman" w:eastAsia="Times New Roman" w:cs="Times New Roman"/>
           <w:iCs/>
           <w:i/>
-        </w:rPr>
-        <w:t xml:space="preserve">Bioinformatics</w:t>
-      </w:r>
-      <w:r>
-        <w:t xml:space="preserve">, 42, btag112.</w:t>
+          <w:color w:val="000000"/>
+        </w:rPr>
+        <w:t xml:space="preserve">Nat. Biotechnol.</w:t>
+      </w:r>
+      <w:r>
+        <w:rPr>
+          <w:rFonts w:ascii="Times New Roman" w:hAnsi="Times New Roman" w:eastAsia="Times New Roman" w:cs="Times New Roman"/>
+          <w:color w:val="000000"/>
+        </w:rPr>
+        <w:t xml:space="preserve">, published online 26 April 2024; 43, 431-442 (2025).</w:t>
       </w:r>
     </w:p>
     <w:p>
       <w:pPr>
         <w:pStyle w:val="BodyText"/>
-      </w:pPr>
-      <w:r>
-        <w:t xml:space="preserve">Naish M. et al. (2021) The genetic and epigenetic landscape of the Arabidopsis centromeres.</w:t>
-      </w:r>
-      <w:r>
+        <w:ind w:firstLine="360"/>
+        <w:jc w:val="left"/>
+      </w:pPr>
+      <w:r>
+        <w:rPr>
+          <w:rFonts w:ascii="Times New Roman" w:hAnsi="Times New Roman" w:eastAsia="Times New Roman" w:cs="Times New Roman"/>
+          <w:color w:val="000000"/>
+        </w:rPr>
+        <w:t xml:space="preserve">English A. (2024a) Project Adotto Tandem-Repeat Regions and Annotations, v1.2.1 (dataset). Zenodo. https://doi.org/10.5281/zenodo.13987414</w:t>
+      </w:r>
+    </w:p>
+    <w:p>
+      <w:pPr>
+        <w:pStyle w:val="BodyText"/>
+        <w:ind w:firstLine="360"/>
+        <w:jc w:val="left"/>
+      </w:pPr>
+      <w:r>
+        <w:rPr>
+          <w:rFonts w:ascii="Times New Roman" w:hAnsi="Times New Roman" w:eastAsia="Times New Roman" w:cs="Times New Roman"/>
+          <w:color w:val="000000"/>
+        </w:rPr>
+        <w:t xml:space="preserve">Genome Reference Consortium (2013) GRCh38 human reference genome assembly (dataset). GenBank assembly accession GCA_000001405.15. https://www.ncbi.nlm.nih.gov/datasets/genome/GCA_000001405.15/</w:t>
+      </w:r>
+    </w:p>
+    <w:p>
+      <w:pPr>
+        <w:pStyle w:val="BodyText"/>
+        <w:ind w:firstLine="360"/>
+        <w:jc w:val="left"/>
+      </w:pPr>
+      <w:r>
+        <w:rPr>
+          <w:rFonts w:ascii="Times New Roman" w:hAnsi="Times New Roman" w:eastAsia="Times New Roman" w:cs="Times New Roman"/>
+          <w:color w:val="000000"/>
+        </w:rPr>
+        <w:t xml:space="preserve">Li H. and Li B. (2026) Finding low-complexity DNA sequences with longdust.</w:t>
+      </w:r>
+      <w:r>
+        <w:rPr>
+          <w:rFonts w:ascii="Times New Roman" w:hAnsi="Times New Roman" w:eastAsia="Times New Roman" w:cs="Times New Roman"/>
+          <w:color w:val="000000"/>
+        </w:rPr>
         <w:t xml:space="preserve"> </w:t>
       </w:r>
       <w:r>
         <w:rPr>
+          <w:rFonts w:ascii="Times New Roman" w:hAnsi="Times New Roman" w:eastAsia="Times New Roman" w:cs="Times New Roman"/>
           <w:iCs/>
           <w:i/>
-        </w:rPr>
-        <w:t xml:space="preserve">Science</w:t>
-      </w:r>
-      <w:r>
-        <w:t xml:space="preserve">, 374, eabi7489.</w:t>
+          <w:color w:val="000000"/>
+        </w:rPr>
+        <w:t xml:space="preserve">Bioinformatics</w:t>
+      </w:r>
+      <w:r>
+        <w:rPr>
+          <w:rFonts w:ascii="Times New Roman" w:hAnsi="Times New Roman" w:eastAsia="Times New Roman" w:cs="Times New Roman"/>
+          <w:color w:val="000000"/>
+        </w:rPr>
+        <w:t xml:space="preserve">, 42, btag112.</w:t>
       </w:r>
     </w:p>
     <w:p>
       <w:pPr>
         <w:pStyle w:val="BodyText"/>
-      </w:pPr>
-      <w:r>
-        <w:t xml:space="preserve">Schatzlab (n.d.) Col-CEN v1.2 genome assembly (dataset), Col-CEN_v1.2.fasta.gz. GitHub. https://github.com/schatzlab/Col-CEN/tree/main/v1.2</w:t>
-      </w:r>
-    </w:p>
-    <w:p>
-      <w:pPr>
-        <w:pStyle w:val="BodyText"/>
-      </w:pPr>
-      <w:r>
-        <w:t xml:space="preserve">Olson D.R. and Wheeler T.J. (2024) ULTRA-effective labeling of tandem repeats in genomic sequence.</w:t>
-      </w:r>
-      <w:r>
+        <w:ind w:firstLine="360"/>
+        <w:jc w:val="left"/>
+      </w:pPr>
+      <w:r>
+        <w:rPr>
+          <w:rFonts w:ascii="Times New Roman" w:hAnsi="Times New Roman" w:eastAsia="Times New Roman" w:cs="Times New Roman"/>
+          <w:color w:val="000000"/>
+        </w:rPr>
+        <w:t xml:space="preserve">Naish M. et al. (2021) The genetic and epigenetic landscape of the Arabidopsis centromeres.</w:t>
+      </w:r>
+      <w:r>
+        <w:rPr>
+          <w:rFonts w:ascii="Times New Roman" w:hAnsi="Times New Roman" w:eastAsia="Times New Roman" w:cs="Times New Roman"/>
+          <w:color w:val="000000"/>
+        </w:rPr>
         <w:t xml:space="preserve"> </w:t>
       </w:r>
       <w:r>
         <w:rPr>
+          <w:rFonts w:ascii="Times New Roman" w:hAnsi="Times New Roman" w:eastAsia="Times New Roman" w:cs="Times New Roman"/>
           <w:iCs/>
           <w:i/>
-        </w:rPr>
-        <w:t xml:space="preserve">Bioinform. Adv.</w:t>
-      </w:r>
-      <w:r>
-        <w:t xml:space="preserve">, 4, vbae149.</w:t>
+          <w:color w:val="000000"/>
+        </w:rPr>
+        <w:t xml:space="preserve">Science</w:t>
+      </w:r>
+      <w:r>
+        <w:rPr>
+          <w:rFonts w:ascii="Times New Roman" w:hAnsi="Times New Roman" w:eastAsia="Times New Roman" w:cs="Times New Roman"/>
+          <w:color w:val="000000"/>
+        </w:rPr>
+        <w:t xml:space="preserve">, 374, eabi7489.</w:t>
       </w:r>
     </w:p>
     <w:p>
       <w:pPr>
         <w:pStyle w:val="BodyText"/>
-      </w:pPr>
-      <w:r>
-        <w:t xml:space="preserve">Sweeten A. et al. (2026) AniAnn’s: alignment-free annotation of tandem repeat arrays using fast average nucleotide identity estimates.</w:t>
-      </w:r>
-      <w:r>
+        <w:ind w:firstLine="360"/>
+        <w:jc w:val="left"/>
+      </w:pPr>
+      <w:r>
+        <w:rPr>
+          <w:rFonts w:ascii="Times New Roman" w:hAnsi="Times New Roman" w:eastAsia="Times New Roman" w:cs="Times New Roman"/>
+          <w:color w:val="000000"/>
+        </w:rPr>
+        <w:t xml:space="preserve">Schatzlab (n.d.) Col-CEN v1.2 genome assembly (dataset), Col-CEN_v1.2.fasta.gz. GitHub. https://github.com/schatzlab/Col-CEN/tree/main/v1.2</w:t>
+      </w:r>
+    </w:p>
+    <w:p>
+      <w:pPr>
+        <w:pStyle w:val="BodyText"/>
+        <w:ind w:firstLine="360"/>
+        <w:jc w:val="left"/>
+      </w:pPr>
+      <w:r>
+        <w:rPr>
+          <w:rFonts w:ascii="Times New Roman" w:hAnsi="Times New Roman" w:eastAsia="Times New Roman" w:cs="Times New Roman"/>
+          <w:color w:val="000000"/>
+        </w:rPr>
+        <w:t xml:space="preserve">Olson D.R. and Wheeler T.J. (2024) ULTRA-effective labeling of tandem repeats in genomic sequence.</w:t>
+      </w:r>
+      <w:r>
+        <w:rPr>
+          <w:rFonts w:ascii="Times New Roman" w:hAnsi="Times New Roman" w:eastAsia="Times New Roman" w:cs="Times New Roman"/>
+          <w:color w:val="000000"/>
+        </w:rPr>
         <w:t xml:space="preserve"> </w:t>
       </w:r>
       <w:r>
         <w:rPr>
+          <w:rFonts w:ascii="Times New Roman" w:hAnsi="Times New Roman" w:eastAsia="Times New Roman" w:cs="Times New Roman"/>
           <w:iCs/>
           <w:i/>
+          <w:color w:val="000000"/>
+        </w:rPr>
+        <w:t xml:space="preserve">Bioinform. Adv.</w:t>
+      </w:r>
+      <w:r>
+        <w:rPr>
+          <w:rFonts w:ascii="Times New Roman" w:hAnsi="Times New Roman" w:eastAsia="Times New Roman" w:cs="Times New Roman"/>
+          <w:color w:val="000000"/>
+        </w:rPr>
+        <w:t xml:space="preserve">, 4, vbae149.</w:t>
+      </w:r>
+    </w:p>
+    <w:p>
+      <w:pPr>
+        <w:pStyle w:val="BodyText"/>
+        <w:ind w:firstLine="360"/>
+        <w:jc w:val="left"/>
+      </w:pPr>
+      <w:r>
+        <w:rPr>
+          <w:rFonts w:ascii="Times New Roman" w:hAnsi="Times New Roman" w:eastAsia="Times New Roman" w:cs="Times New Roman"/>
+          <w:color w:val="000000"/>
+        </w:rPr>
+        <w:t xml:space="preserve">Sweeten A. et al. (2026) AniAnn's: alignment-free annotation of tandem repeat arrays using fast average nucleotide identity estimates.</w:t>
+      </w:r>
+      <w:r>
+        <w:rPr>
+          <w:rFonts w:ascii="Times New Roman" w:hAnsi="Times New Roman" w:eastAsia="Times New Roman" w:cs="Times New Roman"/>
+          <w:color w:val="000000"/>
+        </w:rPr>
+        <w:t xml:space="preserve"> </w:t>
+      </w:r>
+      <w:r>
+        <w:rPr>
+          <w:rFonts w:ascii="Times New Roman" w:hAnsi="Times New Roman" w:eastAsia="Times New Roman" w:cs="Times New Roman"/>
+          <w:iCs/>
+          <w:i/>
+          <w:color w:val="000000"/>
         </w:rPr>
         <w:t xml:space="preserve">Bioinformatics</w:t>
       </w:r>
       <w:r>
+        <w:rPr>
+          <w:rFonts w:ascii="Times New Roman" w:hAnsi="Times New Roman" w:eastAsia="Times New Roman" w:cs="Times New Roman"/>
+          <w:color w:val="000000"/>
+        </w:rPr>
         <w:t xml:space="preserve">, btag581, advance access.</w:t>
       </w:r>
     </w:p>
@@ -470,14 +1285,22 @@
     <w:p>
       <w:pPr>
         <w:pStyle w:val="Heading2"/>
-      </w:pPr>
-      <w:r>
+        <w:ind w:firstLine="0"/>
+      </w:pPr>
+      <w:r>
+        <w:rPr>
+          <w:rFonts w:ascii="Times New Roman" w:hAnsi="Times New Roman" w:eastAsia="Times New Roman" w:cs="Times New Roman"/>
+          <w:b w:val="1"/>
+          <w:bCs w:val="1"/>
+          <w:color w:val="000000"/>
+        </w:rPr>
         <w:t xml:space="preserve">Figure legends</w:t>
       </w:r>
     </w:p>
     <w:p>
       <w:pPr>
         <w:pStyle w:val="FirstParagraph"/>
+        <w:keepNext w:val="1"/>
       </w:pPr>
       <w:r>
         <w:drawing>
@@ -525,42 +1348,93 @@
     <w:p>
       <w:pPr>
         <w:pStyle w:val="BodyText"/>
-      </w:pPr>
-      <w:r>
-        <w:rPr>
+        <w:keepNext w:val="1"/>
+        <w:keepLines w:val="1"/>
+        <w:ind w:firstLine="0"/>
+      </w:pPr>
+      <w:r>
+        <w:rPr>
+          <w:rFonts w:ascii="Times New Roman" w:hAnsi="Times New Roman" w:eastAsia="Times New Roman" w:cs="Times New Roman"/>
+          <w:bCs w:val="1"/>
+          <w:b w:val="1"/>
+          <w:color w:val="000000"/>
+        </w:rPr>
+        <w:t xml:space="preserve">Fig. 1.</w:t>
+      </w:r>
+      <w:r>
+        <w:rPr>
+          <w:rFonts w:ascii="Times New Roman" w:hAnsi="Times New Roman" w:eastAsia="Times New Roman" w:cs="Times New Roman"/>
+          <w:b w:val="1"/>
+          <w:bCs w:val="1"/>
+          <w:color w:val="000000"/>
+        </w:rPr>
+        <w:t xml:space="preserve"> </w:t>
+      </w:r>
+      <w:r>
+        <w:rPr>
+          <w:rFonts w:ascii="Times New Roman" w:hAnsi="Times New Roman" w:eastAsia="Times New Roman" w:cs="Times New Roman"/>
+          <w:b w:val="1"/>
+          <w:bCs w:val="1"/>
+          <w:color w:val="000000"/>
+        </w:rPr>
+        <w:t xml:space="preserve">Paired human range cost (A); separate maize runtime (B) and human core-hour/memory observations (C).</w:t>
+      </w:r>
+      <w:r>
+        <w:rPr>
+          <w:rFonts w:ascii="Times New Roman" w:hAnsi="Times New Roman" w:eastAsia="Times New Roman" w:cs="Times New Roman"/>
+          <w:color w:val="000000"/>
+        </w:rPr>
+        <w:t xml:space="preserve"> Cross-tool ranges, FASTA scopes and memory accounting differ. The full caption is retained (</w:t>
+      </w:r>
+      <w:r>
+        <w:rPr>
+          <w:rFonts w:ascii="Times New Roman" w:hAnsi="Times New Roman" w:eastAsia="Times New Roman" w:cs="Times New Roman"/>
+          <w:color w:val="FF0000"/>
+        </w:rPr>
+        <w:t xml:space="preserve">Supplementary Fig. S1</w:t>
+      </w:r>
+      <w:r>
+        <w:rPr>
+          <w:rFonts w:ascii="Times New Roman" w:hAnsi="Times New Roman" w:eastAsia="Times New Roman" w:cs="Times New Roman"/>
+          <w:color w:val="000000"/>
+        </w:rPr>
+        <w:t xml:space="preserve">).</w:t>
+      </w:r>
+    </w:p>
+    <w:p>
+      <w:pPr>
+        <w:pStyle w:val="BodyText"/>
+        <w:spacing w:before="0" w:after="0"/>
+        <w:ind w:firstLine="0"/>
+      </w:pPr>
+      <w:r>
+        <w:rPr>
+          <w:rFonts w:ascii="Times New Roman" w:hAnsi="Times New Roman" w:eastAsia="Times New Roman" w:cs="Times New Roman"/>
           <w:bCs/>
           <w:b/>
-        </w:rPr>
-        <w:t xml:space="preserve">Fig. 1.</w:t>
-      </w:r>
-      <w:r>
+          <w:color w:val="000000"/>
+        </w:rPr>
+        <w:t xml:space="preserve">Alt text:</w:t>
+      </w:r>
+      <w:r>
+        <w:rPr>
+          <w:rFonts w:ascii="Times New Roman" w:hAnsi="Times New Roman" w:eastAsia="Times New Roman" w:cs="Times New Roman"/>
+          <w:color w:val="000000"/>
+        </w:rPr>
         <w:t xml:space="preserve"> </w:t>
       </w:r>
       <w:r>
-        <w:t xml:space="preserve">Paired human range cost (A); separate maize runtime (B) and human core-hour/memory observations (C). Cross-tool ranges, FASTA scopes and memory accounting differ. Original Figure 2 and its complete caption are preserved as Supplementary Figure 2.</w:t>
+        <w:rPr>
+          <w:rFonts w:ascii="Times New Roman" w:hAnsi="Times New Roman" w:eastAsia="Times New Roman" w:cs="Times New Roman"/>
+          <w:color w:val="000000"/>
+        </w:rPr>
+        <w:t xml:space="preserve">Three-panel chart. Panel A is a slope chart of three paired human runs: runtime rises from about 4 hours at a 100 bp maximum period to 7.1-7.3 hours at 2,000 bp, with the per-replicate ratios 1.77-1.82 labelled beside the endpoints. Panel B shows observed ULTRA and TRF maize runtimes rising with the maximum period on log-log axes. Panel C shows dot plots of per-tool human core-hours and peak memory, each point labelled with its period cap; ranges and inputs are not matched across tools.</w:t>
       </w:r>
     </w:p>
     <w:p>
       <w:pPr>
         <w:pStyle w:val="BodyText"/>
-      </w:pPr>
-      <w:r>
-        <w:rPr>
-          <w:bCs/>
-          <w:b/>
-        </w:rPr>
-        <w:t xml:space="preserve">Alt text:</w:t>
-      </w:r>
-      <w:r>
-        <w:t xml:space="preserve"> </w:t>
-      </w:r>
-      <w:r>
-        <w:t xml:space="preserve">Three-panel chart. Panel A is a slope chart of three paired human runs: runtime rises from about 4 hours at a 100 bp maximum period to 7.1–7.3 hours at 2,000 bp, with the per-replicate ratios 1.77–1.82 labelled beside the endpoints. Panel B shows observed ULTRA and TRF maize runtimes rising with the maximum period on log–log axes. Panel C shows dot plots of per-tool human core-hours and peak memory, each point labelled with its period cap; ranges and inputs are not matched across tools.</w:t>
-      </w:r>
-    </w:p>
-    <w:p>
-      <w:pPr>
-        <w:pStyle w:val="BodyText"/>
+        <w:keepNext w:val="1"/>
       </w:pPr>
       <w:r>
         <w:drawing>
@@ -608,37 +1482,87 @@
     <w:p>
       <w:pPr>
         <w:pStyle w:val="BodyText"/>
-      </w:pPr>
-      <w:r>
-        <w:rPr>
+        <w:keepNext w:val="1"/>
+        <w:keepLines w:val="1"/>
+        <w:ind w:firstLine="0"/>
+      </w:pPr>
+      <w:r>
+        <w:rPr>
+          <w:rFonts w:ascii="Times New Roman" w:hAnsi="Times New Roman" w:eastAsia="Times New Roman" w:cs="Times New Roman"/>
+          <w:bCs w:val="1"/>
+          <w:b w:val="1"/>
+          <w:color w:val="000000"/>
+        </w:rPr>
+        <w:t xml:space="preserve">Fig. 2.</w:t>
+      </w:r>
+      <w:r>
+        <w:rPr>
+          <w:rFonts w:ascii="Times New Roman" w:hAnsi="Times New Roman" w:eastAsia="Times New Roman" w:cs="Times New Roman"/>
+          <w:b w:val="1"/>
+          <w:bCs w:val="1"/>
+          <w:color w:val="000000"/>
+        </w:rPr>
+        <w:t xml:space="preserve"> </w:t>
+      </w:r>
+      <w:r>
+        <w:rPr>
+          <w:rFonts w:ascii="Times New Roman" w:hAnsi="Times New Roman" w:eastAsia="Times New Roman" w:cs="Times New Roman"/>
+          <w:b w:val="1"/>
+          <w:bCs w:val="1"/>
+          <w:color w:val="000000"/>
+        </w:rPr>
+        <w:t xml:space="preserve">Native-period-100 operating points (A-B) and reciprocal-overlap sensitivity of post-filtered full-range output (C).</w:t>
+      </w:r>
+      <w:r>
+        <w:rPr>
+          <w:rFonts w:ascii="Times New Roman" w:hAnsi="Times New Roman" w:eastAsia="Times New Roman" w:cs="Times New Roman"/>
+          <w:color w:val="000000"/>
+        </w:rPr>
+        <w:t xml:space="preserve"> The 2026 points in A-B are full-range, not band-matched. The full caption is retained (</w:t>
+      </w:r>
+      <w:r>
+        <w:rPr>
+          <w:rFonts w:ascii="Times New Roman" w:hAnsi="Times New Roman" w:eastAsia="Times New Roman" w:cs="Times New Roman"/>
+          <w:color w:val="FF0000"/>
+        </w:rPr>
+        <w:t xml:space="preserve">Supplementary Fig. S4</w:t>
+      </w:r>
+      <w:r>
+        <w:rPr>
+          <w:rFonts w:ascii="Times New Roman" w:hAnsi="Times New Roman" w:eastAsia="Times New Roman" w:cs="Times New Roman"/>
+          <w:color w:val="000000"/>
+        </w:rPr>
+        <w:t xml:space="preserve">).</w:t>
+      </w:r>
+    </w:p>
+    <w:p>
+      <w:pPr>
+        <w:pStyle w:val="BodyText"/>
+        <w:spacing w:before="0" w:after="0"/>
+        <w:ind w:firstLine="0"/>
+      </w:pPr>
+      <w:r>
+        <w:rPr>
+          <w:rFonts w:ascii="Times New Roman" w:hAnsi="Times New Roman" w:eastAsia="Times New Roman" w:cs="Times New Roman"/>
           <w:bCs/>
           <w:b/>
-        </w:rPr>
-        <w:t xml:space="preserve">Fig. 2.</w:t>
-      </w:r>
-      <w:r>
+          <w:color w:val="000000"/>
+        </w:rPr>
+        <w:t xml:space="preserve">Alt text:</w:t>
+      </w:r>
+      <w:r>
+        <w:rPr>
+          <w:rFonts w:ascii="Times New Roman" w:hAnsi="Times New Roman" w:eastAsia="Times New Roman" w:cs="Times New Roman"/>
+          <w:color w:val="000000"/>
+        </w:rPr>
         <w:t xml:space="preserve"> </w:t>
       </w:r>
       <w:r>
-        <w:t xml:space="preserve">Native-period-100 operating points (A–B) and reciprocal-overlap sensitivity of post-filtered full-range output (C). The 2026 points in A–B are full-range, not band-matched. Original Figure 1 and its complete caption are preserved as Supplementary Figure 1.</w:t>
-      </w:r>
-    </w:p>
-    <w:p>
-      <w:pPr>
-        <w:pStyle w:val="BodyText"/>
-      </w:pPr>
-      <w:r>
-        <w:rPr>
-          <w:bCs/>
-          <w:b/>
-        </w:rPr>
-        <w:t xml:space="preserve">Alt text:</w:t>
-      </w:r>
-      <w:r>
-        <w:t xml:space="preserve"> </w:t>
-      </w:r>
-      <w:r>
-        <w:t xml:space="preserve">Three-panel chart. Panels A and B plot region-level and base-pair precision against recall on GRCh38: BWTandem’s four operating points P, B, F and H form a connected line whose precision falls as recall rises, and each competing tool is a single labelled point. Panel C plots region recall at periods of 100 bp or less under the one-base, reciprocal-0.25 and reciprocal-0.50 overlap rules; every tool’s recall falls under the stricter rules, with ULTRA highest and BWTandem second throughout.</w:t>
+        <w:rPr>
+          <w:rFonts w:ascii="Times New Roman" w:hAnsi="Times New Roman" w:eastAsia="Times New Roman" w:cs="Times New Roman"/>
+          <w:color w:val="000000"/>
+        </w:rPr>
+        <w:t xml:space="preserve">Three-panel chart. Panels A and B plot region-level and base-pair precision against recall on GRCh38: BWTandem's four operating points P, B, F and H form a connected line whose precision falls as recall rises, and each competing tool is a single labelled point. Panel C plots region recall at periods of 100 bp or less under the one-base, reciprocal-0.25 and reciprocal-0.50 overlap rules; every tool's recall falls under the stricter rules, with ULTRA highest and BWTandem second throughout.</w:t>
       </w:r>
     </w:p>
     <w:bookmarkEnd w:id="33"/>
@@ -760,7 +1684,8 @@
   <w:docDefaults>
     <w:rPrDefault>
       <w:rPr>
-        <w:rFonts w:asciiTheme="minorHAnsi" w:cstheme="minorBidi" w:eastAsiaTheme="minorHAnsi" w:hAnsiTheme="minorHAnsi"/>
+        <w:rFonts w:ascii="Times New Roman" w:hAnsi="Times New Roman" w:eastAsia="Times New Roman" w:cs="Times New Roman"/>
+        <w:color w:val="000000"/>
         <w:sz w:val="24"/>
         <w:szCs w:val="24"/>
         <w:lang w:bidi="ar-SA" w:eastAsia="en-US" w:val="en-US"/>
@@ -776,6 +1701,10 @@
   <w:style w:default="1" w:styleId="Normal" w:type="paragraph">
     <w:name w:val="Normal"/>
     <w:qFormat/>
+    <w:rPr>
+      <w:rFonts w:ascii="Times New Roman" w:hAnsi="Times New Roman" w:eastAsia="Times New Roman" w:cs="Times New Roman"/>
+      <w:color w:val="000000"/>
+    </w:rPr>
   </w:style>
   <w:style w:styleId="BodyText" w:type="paragraph">
     <w:name w:val="Body Text"/>
@@ -785,12 +1714,20 @@
       <w:spacing w:after="180" w:before="180"/>
     </w:pPr>
     <w:qFormat/>
+    <w:rPr>
+      <w:rFonts w:ascii="Times New Roman" w:hAnsi="Times New Roman" w:eastAsia="Times New Roman" w:cs="Times New Roman"/>
+      <w:color w:val="000000"/>
+    </w:rPr>
   </w:style>
   <w:style w:customStyle="1" w:styleId="FirstParagraph" w:type="paragraph">
     <w:name w:val="First Paragraph"/>
     <w:basedOn w:val="BodyText"/>
     <w:next w:val="BodyText"/>
     <w:qFormat/>
+    <w:rPr>
+      <w:rFonts w:ascii="Times New Roman" w:hAnsi="Times New Roman" w:eastAsia="Times New Roman" w:cs="Times New Roman"/>
+      <w:color w:val="000000"/>
+    </w:rPr>
   </w:style>
   <w:style w:customStyle="1" w:styleId="Compact" w:type="paragraph">
     <w:name w:val="Compact"/>
@@ -799,6 +1736,10 @@
     <w:pPr>
       <w:spacing w:after="36" w:before="36"/>
     </w:pPr>
+    <w:rPr>
+      <w:rFonts w:ascii="Times New Roman" w:hAnsi="Times New Roman" w:eastAsia="Times New Roman" w:cs="Times New Roman"/>
+      <w:color w:val="000000"/>
+    </w:rPr>
   </w:style>
   <w:style w:styleId="Title" w:type="paragraph">
     <w:name w:val="Title"/>
@@ -812,10 +1753,10 @@
       <w:jc w:val="center"/>
     </w:pPr>
     <w:rPr>
-      <w:rFonts w:asciiTheme="majorHAnsi" w:cstheme="majorBidi" w:eastAsiaTheme="majorEastAsia" w:hAnsiTheme="majorHAnsi"/>
+      <w:rFonts w:ascii="Times New Roman" w:hAnsi="Times New Roman" w:eastAsia="Times New Roman" w:cs="Times New Roman"/>
       <w:b/>
       <w:bCs/>
-      <w:color w:themeColor="accent1" w:themeShade="B5" w:val="345A8A"/>
+      <w:color w:val="000000"/>
       <w:sz w:val="36"/>
       <w:szCs w:val="36"/>
     </w:rPr>
@@ -832,6 +1773,8 @@
       <w:jc w:val="center"/>
     </w:pPr>
     <w:rPr>
+      <w:rFonts w:ascii="Times New Roman" w:hAnsi="Times New Roman" w:eastAsia="Times New Roman" w:cs="Times New Roman"/>
+      <w:color w:val="000000"/>
       <w:sz w:val="30"/>
       <w:szCs w:val="30"/>
     </w:rPr>
@@ -845,6 +1788,10 @@
       <w:keepLines/>
       <w:jc w:val="center"/>
     </w:pPr>
+    <w:rPr>
+      <w:rFonts w:ascii="Times New Roman" w:hAnsi="Times New Roman" w:eastAsia="Times New Roman" w:cs="Times New Roman"/>
+      <w:color w:val="000000"/>
+    </w:rPr>
   </w:style>
   <w:style w:styleId="Date" w:type="paragraph">
     <w:name w:val="Date"/>
@@ -855,6 +1802,10 @@
       <w:keepLines/>
       <w:jc w:val="center"/>
     </w:pPr>
+    <w:rPr>
+      <w:rFonts w:ascii="Times New Roman" w:hAnsi="Times New Roman" w:eastAsia="Times New Roman" w:cs="Times New Roman"/>
+      <w:color w:val="000000"/>
+    </w:rPr>
   </w:style>
   <w:style w:customStyle="1" w:styleId="Abstract" w:type="paragraph">
     <w:name w:val="Abstract"/>
@@ -867,6 +1818,8 @@
       <w:spacing w:after="300" w:before="300"/>
     </w:pPr>
     <w:rPr>
+      <w:rFonts w:ascii="Times New Roman" w:hAnsi="Times New Roman" w:eastAsia="Times New Roman" w:cs="Times New Roman"/>
+      <w:color w:val="000000"/>
       <w:sz w:val="20"/>
       <w:szCs w:val="20"/>
     </w:rPr>
@@ -877,7 +1830,10 @@
     <w:next w:val="Bibliography"/>
     <w:qFormat/>
     <w:pPr/>
-    <w:rPr/>
+    <w:rPr>
+      <w:rFonts w:ascii="Times New Roman" w:hAnsi="Times New Roman" w:eastAsia="Times New Roman" w:cs="Times New Roman"/>
+      <w:color w:val="000000"/>
+    </w:rPr>
   </w:style>
   <w:style w:styleId="Heading1" w:type="paragraph">
     <w:name w:val="Heading 1"/>
@@ -889,13 +1845,14 @@
       <w:keepNext/>
       <w:keepLines/>
       <w:spacing w:after="0" w:before="480"/>
+      <w:ind w:firstLine="0"/>
       <w:outlineLvl w:val="0"/>
     </w:pPr>
     <w:rPr>
-      <w:rFonts w:asciiTheme="majorHAnsi" w:cstheme="majorBidi" w:eastAsiaTheme="majorEastAsia" w:hAnsiTheme="majorHAnsi"/>
-      <w:b/>
-      <w:bCs/>
-      <w:color w:themeColor="accent1" w:val="4F81BD"/>
+      <w:rFonts w:ascii="Times New Roman" w:hAnsi="Times New Roman" w:eastAsia="Times New Roman" w:cs="Times New Roman"/>
+      <w:b w:val="1"/>
+      <w:bCs w:val="1"/>
+      <w:color w:val="000000"/>
       <w:sz w:val="32"/>
       <w:szCs w:val="32"/>
     </w:rPr>
@@ -911,13 +1868,14 @@
       <w:keepNext/>
       <w:keepLines/>
       <w:spacing w:after="0" w:before="200"/>
+      <w:ind w:firstLine="0"/>
       <w:outlineLvl w:val="1"/>
     </w:pPr>
     <w:rPr>
-      <w:rFonts w:asciiTheme="majorHAnsi" w:cstheme="majorBidi" w:eastAsiaTheme="majorEastAsia" w:hAnsiTheme="majorHAnsi"/>
-      <w:b/>
-      <w:bCs/>
-      <w:color w:themeColor="accent1" w:val="4F81BD"/>
+      <w:rFonts w:ascii="Times New Roman" w:hAnsi="Times New Roman" w:eastAsia="Times New Roman" w:cs="Times New Roman"/>
+      <w:b w:val="1"/>
+      <w:bCs w:val="1"/>
+      <w:color w:val="000000"/>
       <w:sz w:val="28"/>
       <w:szCs w:val="28"/>
     </w:rPr>
@@ -933,13 +1891,14 @@
       <w:keepNext/>
       <w:keepLines/>
       <w:spacing w:after="0" w:before="200"/>
+      <w:ind w:firstLine="0"/>
       <w:outlineLvl w:val="2"/>
     </w:pPr>
     <w:rPr>
-      <w:rFonts w:asciiTheme="majorHAnsi" w:cstheme="majorBidi" w:eastAsiaTheme="majorEastAsia" w:hAnsiTheme="majorHAnsi"/>
-      <w:b/>
-      <w:bCs/>
-      <w:color w:themeColor="accent1" w:val="4F81BD"/>
+      <w:rFonts w:ascii="Times New Roman" w:hAnsi="Times New Roman" w:eastAsia="Times New Roman" w:cs="Times New Roman"/>
+      <w:b w:val="1"/>
+      <w:bCs w:val="1"/>
+      <w:color w:val="000000"/>
       <w:sz w:val="24"/>
       <w:szCs w:val="24"/>
     </w:rPr>
@@ -955,13 +1914,15 @@
       <w:keepNext/>
       <w:keepLines/>
       <w:spacing w:after="0" w:before="200"/>
+      <w:ind w:firstLine="0"/>
       <w:outlineLvl w:val="3"/>
     </w:pPr>
     <w:rPr>
-      <w:rFonts w:asciiTheme="majorHAnsi" w:cstheme="majorBidi" w:eastAsiaTheme="majorEastAsia" w:hAnsiTheme="majorHAnsi"/>
+      <w:rFonts w:ascii="Times New Roman" w:hAnsi="Times New Roman" w:eastAsia="Times New Roman" w:cs="Times New Roman"/>
+      <w:b w:val="1"/>
       <w:i/>
-      <w:bCs/>
-      <w:color w:themeColor="accent1" w:val="4F81BD"/>
+      <w:bCs w:val="1"/>
+      <w:color w:val="000000"/>
       <w:sz w:val="24"/>
       <w:szCs w:val="24"/>
     </w:rPr>
@@ -977,12 +1938,15 @@
       <w:keepNext/>
       <w:keepLines/>
       <w:spacing w:after="0" w:before="200"/>
+      <w:ind w:firstLine="0"/>
       <w:outlineLvl w:val="4"/>
     </w:pPr>
     <w:rPr>
-      <w:rFonts w:asciiTheme="majorHAnsi" w:cstheme="majorBidi" w:eastAsiaTheme="majorEastAsia" w:hAnsiTheme="majorHAnsi"/>
+      <w:rFonts w:ascii="Times New Roman" w:hAnsi="Times New Roman" w:eastAsia="Times New Roman" w:cs="Times New Roman"/>
+      <w:b w:val="1"/>
+      <w:bCs w:val="1"/>
       <w:iCs/>
-      <w:color w:themeColor="accent1" w:val="4F81BD"/>
+      <w:color w:val="000000"/>
       <w:sz w:val="24"/>
       <w:szCs w:val="24"/>
     </w:rPr>
@@ -998,11 +1962,14 @@
       <w:keepNext/>
       <w:keepLines/>
       <w:spacing w:after="0" w:before="200"/>
+      <w:ind w:firstLine="0"/>
       <w:outlineLvl w:val="5"/>
     </w:pPr>
     <w:rPr>
-      <w:rFonts w:asciiTheme="majorHAnsi" w:cstheme="majorBidi" w:eastAsiaTheme="majorEastAsia" w:hAnsiTheme="majorHAnsi"/>
-      <w:color w:themeColor="accent1" w:val="4F81BD"/>
+      <w:rFonts w:ascii="Times New Roman" w:hAnsi="Times New Roman" w:eastAsia="Times New Roman" w:cs="Times New Roman"/>
+      <w:b w:val="1"/>
+      <w:bCs w:val="1"/>
+      <w:color w:val="000000"/>
       <w:sz w:val="24"/>
       <w:szCs w:val="24"/>
     </w:rPr>
@@ -1018,11 +1985,14 @@
       <w:keepNext/>
       <w:keepLines/>
       <w:spacing w:after="0" w:before="200"/>
+      <w:ind w:firstLine="0"/>
       <w:outlineLvl w:val="6"/>
     </w:pPr>
     <w:rPr>
-      <w:rFonts w:asciiTheme="majorHAnsi" w:cstheme="majorBidi" w:eastAsiaTheme="majorEastAsia" w:hAnsiTheme="majorHAnsi"/>
-      <w:color w:themeColor="accent1" w:val="4F81BD"/>
+      <w:rFonts w:ascii="Times New Roman" w:hAnsi="Times New Roman" w:eastAsia="Times New Roman" w:cs="Times New Roman"/>
+      <w:b w:val="1"/>
+      <w:bCs w:val="1"/>
+      <w:color w:val="000000"/>
       <w:sz w:val="24"/>
       <w:szCs w:val="24"/>
     </w:rPr>
@@ -1038,11 +2008,14 @@
       <w:keepNext/>
       <w:keepLines/>
       <w:spacing w:after="0" w:before="200"/>
+      <w:ind w:firstLine="0"/>
       <w:outlineLvl w:val="7"/>
     </w:pPr>
     <w:rPr>
-      <w:rFonts w:asciiTheme="majorHAnsi" w:cstheme="majorBidi" w:eastAsiaTheme="majorEastAsia" w:hAnsiTheme="majorHAnsi"/>
-      <w:color w:themeColor="accent1" w:val="4F81BD"/>
+      <w:rFonts w:ascii="Times New Roman" w:hAnsi="Times New Roman" w:eastAsia="Times New Roman" w:cs="Times New Roman"/>
+      <w:b w:val="1"/>
+      <w:bCs w:val="1"/>
+      <w:color w:val="000000"/>
       <w:sz w:val="24"/>
       <w:szCs w:val="24"/>
     </w:rPr>
@@ -1058,11 +2031,14 @@
       <w:keepNext/>
       <w:keepLines/>
       <w:spacing w:after="0" w:before="200"/>
+      <w:ind w:firstLine="0"/>
       <w:outlineLvl w:val="8"/>
     </w:pPr>
     <w:rPr>
-      <w:rFonts w:asciiTheme="majorHAnsi" w:cstheme="majorBidi" w:eastAsiaTheme="majorEastAsia" w:hAnsiTheme="majorHAnsi"/>
-      <w:color w:themeColor="accent1" w:val="4F81BD"/>
+      <w:rFonts w:ascii="Times New Roman" w:hAnsi="Times New Roman" w:eastAsia="Times New Roman" w:cs="Times New Roman"/>
+      <w:b w:val="1"/>
+      <w:bCs w:val="1"/>
+      <w:color w:val="000000"/>
       <w:sz w:val="24"/>
       <w:szCs w:val="24"/>
     </w:rPr>
@@ -1078,6 +2054,10 @@
       <w:spacing w:after="100" w:before="100"/>
       <w:ind w:firstLine="0" w:left="480" w:right="480"/>
     </w:pPr>
+    <w:rPr>
+      <w:rFonts w:ascii="Times New Roman" w:hAnsi="Times New Roman" w:eastAsia="Times New Roman" w:cs="Times New Roman"/>
+      <w:color w:val="000000"/>
+    </w:rPr>
   </w:style>
   <w:style w:styleId="FootnoteText" w:type="paragraph">
     <w:name w:val="Footnote Text"/>
@@ -1086,11 +2066,19 @@
     <w:uiPriority w:val="9"/>
     <w:unhideWhenUsed/>
     <w:qFormat/>
+    <w:rPr>
+      <w:rFonts w:ascii="Times New Roman" w:hAnsi="Times New Roman" w:eastAsia="Times New Roman" w:cs="Times New Roman"/>
+      <w:color w:val="000000"/>
+    </w:rPr>
   </w:style>
   <w:style w:default="1" w:styleId="DefaultParagraphFont" w:type="character">
     <w:name w:val="Default Paragraph Font"/>
     <w:semiHidden/>
     <w:unhideWhenUsed/>
+    <w:rPr>
+      <w:rFonts w:ascii="Times New Roman" w:hAnsi="Times New Roman" w:eastAsia="Times New Roman" w:cs="Times New Roman"/>
+      <w:color w:val="000000"/>
+    </w:rPr>
   </w:style>
   <w:style w:default="1" w:styleId="Table" w:type="table">
     <w:name w:val="Table"/>
@@ -1098,6 +2086,10 @@
     <w:semiHidden/>
     <w:unhideWhenUsed/>
     <w:qFormat/>
+    <w:rPr>
+      <w:rFonts w:ascii="Times New Roman" w:hAnsi="Times New Roman" w:eastAsia="Times New Roman" w:cs="Times New Roman"/>
+      <w:color w:val="000000"/>
+    </w:rPr>
     <w:tblPr>
       <w:tblInd w:type="dxa" w:w="0"/>
       <w:tblCellMar>
@@ -1133,12 +2125,18 @@
       <w:spacing w:after="0"/>
     </w:pPr>
     <w:rPr>
+      <w:rFonts w:ascii="Times New Roman" w:hAnsi="Times New Roman" w:eastAsia="Times New Roman" w:cs="Times New Roman"/>
       <w:b/>
+      <w:color w:val="000000"/>
     </w:rPr>
   </w:style>
   <w:style w:customStyle="1" w:styleId="Definition" w:type="paragraph">
     <w:name w:val="Definition"/>
     <w:basedOn w:val="Normal"/>
+    <w:rPr>
+      <w:rFonts w:ascii="Times New Roman" w:hAnsi="Times New Roman" w:eastAsia="Times New Roman" w:cs="Times New Roman"/>
+      <w:color w:val="000000"/>
+    </w:rPr>
   </w:style>
   <w:style w:styleId="Caption" w:type="paragraph">
     <w:name w:val="Caption"/>
@@ -1148,7 +2146,9 @@
       <w:spacing w:after="120" w:before="0"/>
     </w:pPr>
     <w:rPr>
+      <w:rFonts w:ascii="Times New Roman" w:hAnsi="Times New Roman" w:eastAsia="Times New Roman" w:cs="Times New Roman"/>
       <w:i/>
+      <w:color w:val="000000"/>
     </w:rPr>
   </w:style>
   <w:style w:customStyle="1" w:styleId="TableCaption" w:type="paragraph">
@@ -1157,14 +2157,26 @@
     <w:pPr>
       <w:keepNext/>
     </w:pPr>
+    <w:rPr>
+      <w:rFonts w:ascii="Times New Roman" w:hAnsi="Times New Roman" w:eastAsia="Times New Roman" w:cs="Times New Roman"/>
+      <w:color w:val="000000"/>
+    </w:rPr>
   </w:style>
   <w:style w:customStyle="1" w:styleId="ImageCaption" w:type="paragraph">
     <w:name w:val="Image Caption"/>
     <w:basedOn w:val="Caption"/>
+    <w:rPr>
+      <w:rFonts w:ascii="Times New Roman" w:hAnsi="Times New Roman" w:eastAsia="Times New Roman" w:cs="Times New Roman"/>
+      <w:color w:val="000000"/>
+    </w:rPr>
   </w:style>
   <w:style w:customStyle="1" w:styleId="Figure" w:type="paragraph">
     <w:name w:val="Figure"/>
     <w:basedOn w:val="Normal"/>
+    <w:rPr>
+      <w:rFonts w:ascii="Times New Roman" w:hAnsi="Times New Roman" w:eastAsia="Times New Roman" w:cs="Times New Roman"/>
+      <w:color w:val="000000"/>
+    </w:rPr>
   </w:style>
   <w:style w:customStyle="1" w:styleId="CaptionedFigure" w:type="paragraph">
     <w:name w:val="Captioned Figure"/>
@@ -1172,28 +2184,43 @@
     <w:pPr>
       <w:keepNext/>
     </w:pPr>
+    <w:rPr>
+      <w:rFonts w:ascii="Times New Roman" w:hAnsi="Times New Roman" w:eastAsia="Times New Roman" w:cs="Times New Roman"/>
+      <w:color w:val="000000"/>
+    </w:rPr>
   </w:style>
   <w:style w:customStyle="1" w:styleId="BodyTextChar" w:type="character">
     <w:name w:val="Body Text Char"/>
     <w:basedOn w:val="DefaultParagraphFont"/>
     <w:link w:val="BodyText"/>
+    <w:rPr>
+      <w:rFonts w:ascii="Times New Roman" w:hAnsi="Times New Roman" w:eastAsia="Times New Roman" w:cs="Times New Roman"/>
+      <w:color w:val="000000"/>
+    </w:rPr>
   </w:style>
   <w:style w:customStyle="1" w:styleId="VerbatimChar" w:type="character">
     <w:name w:val="Verbatim Char"/>
     <w:basedOn w:val="BodyTextChar"/>
     <w:rPr>
-      <w:rFonts w:ascii="Consolas" w:hAnsi="Consolas"/>
+      <w:rFonts w:ascii="Times New Roman" w:hAnsi="Times New Roman" w:eastAsia="Times New Roman" w:cs="Times New Roman"/>
+      <w:color w:val="000000"/>
       <w:sz w:val="22"/>
     </w:rPr>
   </w:style>
   <w:style w:customStyle="1" w:styleId="SectionNumber" w:type="character">
     <w:name w:val="Section Number"/>
     <w:basedOn w:val="BodyTextChar"/>
+    <w:rPr>
+      <w:rFonts w:ascii="Times New Roman" w:hAnsi="Times New Roman" w:eastAsia="Times New Roman" w:cs="Times New Roman"/>
+      <w:color w:val="000000"/>
+    </w:rPr>
   </w:style>
   <w:style w:styleId="FootnoteReference" w:type="character">
     <w:name w:val="Footnote Reference"/>
     <w:basedOn w:val="BodyTextChar"/>
     <w:rPr>
+      <w:rFonts w:ascii="Times New Roman" w:hAnsi="Times New Roman" w:eastAsia="Times New Roman" w:cs="Times New Roman"/>
+      <w:color w:val="000000"/>
       <w:vertAlign w:val="superscript"/>
     </w:rPr>
   </w:style>
@@ -1201,7 +2228,8 @@
     <w:name w:val="Hyperlink"/>
     <w:basedOn w:val="BodyTextChar"/>
     <w:rPr>
-      <w:color w:themeColor="accent1" w:val="4F81BD"/>
+      <w:rFonts w:ascii="Times New Roman" w:hAnsi="Times New Roman" w:eastAsia="Times New Roman" w:cs="Times New Roman"/>
+      <w:color w:val="000000"/>
     </w:rPr>
   </w:style>
   <w:style w:styleId="TOCHeading" w:type="paragraph">
@@ -1213,13 +2241,23 @@
     <w:qFormat/>
     <w:pPr>
       <w:spacing w:before="240" w:line="259" w:lineRule="auto"/>
+      <w:ind w:firstLine="0"/>
       <w:outlineLvl w:val="9"/>
     </w:pPr>
     <w:rPr>
-      <w:rFonts w:asciiTheme="majorHAnsi" w:cstheme="majorBidi" w:eastAsiaTheme="majorEastAsia" w:hAnsiTheme="majorHAnsi"/>
-      <w:b w:val="0"/>
-      <w:bCs w:val="0"/>
-      <w:color w:themeColor="accent1" w:themeShade="BF" w:val="365F91"/>
+      <w:rFonts w:ascii="Times New Roman" w:hAnsi="Times New Roman" w:eastAsia="Times New Roman" w:cs="Times New Roman"/>
+      <w:b w:val="1"/>
+      <w:bCs w:val="1"/>
+      <w:color w:val="000000"/>
+    </w:rPr>
+  </w:style>
+  <w:style w:type="paragraph" w:customStyle="1" w:styleId="Affiliation">
+    <w:name w:val="Affiliation"/>
+    <w:basedOn w:val="BodyText"/>
+    <w:qFormat/>
+    <w:rPr>
+      <w:rFonts w:ascii="Times New Roman" w:hAnsi="Times New Roman" w:eastAsia="Times New Roman" w:cs="Times New Roman"/>
+      <w:color w:val="000000"/>
     </w:rPr>
   </w:style>
   <w:style w:type="paragraph" w:customStyle="1" w:styleId="SourceCode">
@@ -1229,12 +2267,17 @@
     <w:pPr>
       <w:wordWrap w:val="off"/>
     </w:pPr>
+    <w:rPr>
+      <w:rFonts w:ascii="Times New Roman" w:hAnsi="Times New Roman" w:eastAsia="Times New Roman" w:cs="Times New Roman"/>
+      <w:color w:val="000000"/>
+    </w:rPr>
   </w:style>
   <w:style w:type="character" w:customStyle="1" w:styleId="KeywordTok">
     <w:name w:val="KeywordTok"/>
     <w:basedOn w:val="VerbatimChar"/>
     <w:rPr>
-      <w:color w:val="007020"/>
+      <w:rFonts w:ascii="Times New Roman" w:hAnsi="Times New Roman" w:eastAsia="Times New Roman" w:cs="Times New Roman"/>
+      <w:color w:val="000000"/>
       <w:b/>
     </w:rPr>
   </w:style>
@@ -1242,77 +2285,88 @@
     <w:name w:val="DataTypeTok"/>
     <w:basedOn w:val="VerbatimChar"/>
     <w:rPr>
-      <w:color w:val="902000"/>
+      <w:rFonts w:ascii="Times New Roman" w:hAnsi="Times New Roman" w:eastAsia="Times New Roman" w:cs="Times New Roman"/>
+      <w:color w:val="000000"/>
     </w:rPr>
   </w:style>
   <w:style w:type="character" w:customStyle="1" w:styleId="DecValTok">
     <w:name w:val="DecValTok"/>
     <w:basedOn w:val="VerbatimChar"/>
     <w:rPr>
-      <w:color w:val="40a070"/>
+      <w:rFonts w:ascii="Times New Roman" w:hAnsi="Times New Roman" w:eastAsia="Times New Roman" w:cs="Times New Roman"/>
+      <w:color w:val="000000"/>
     </w:rPr>
   </w:style>
   <w:style w:type="character" w:customStyle="1" w:styleId="BaseNTok">
     <w:name w:val="BaseNTok"/>
     <w:basedOn w:val="VerbatimChar"/>
     <w:rPr>
-      <w:color w:val="40a070"/>
+      <w:rFonts w:ascii="Times New Roman" w:hAnsi="Times New Roman" w:eastAsia="Times New Roman" w:cs="Times New Roman"/>
+      <w:color w:val="000000"/>
     </w:rPr>
   </w:style>
   <w:style w:type="character" w:customStyle="1" w:styleId="FloatTok">
     <w:name w:val="FloatTok"/>
     <w:basedOn w:val="VerbatimChar"/>
     <w:rPr>
-      <w:color w:val="40a070"/>
+      <w:rFonts w:ascii="Times New Roman" w:hAnsi="Times New Roman" w:eastAsia="Times New Roman" w:cs="Times New Roman"/>
+      <w:color w:val="000000"/>
     </w:rPr>
   </w:style>
   <w:style w:type="character" w:customStyle="1" w:styleId="ConstantTok">
     <w:name w:val="ConstantTok"/>
     <w:basedOn w:val="VerbatimChar"/>
     <w:rPr>
-      <w:color w:val="880000"/>
+      <w:rFonts w:ascii="Times New Roman" w:hAnsi="Times New Roman" w:eastAsia="Times New Roman" w:cs="Times New Roman"/>
+      <w:color w:val="000000"/>
     </w:rPr>
   </w:style>
   <w:style w:type="character" w:customStyle="1" w:styleId="CharTok">
     <w:name w:val="CharTok"/>
     <w:basedOn w:val="VerbatimChar"/>
     <w:rPr>
-      <w:color w:val="4070a0"/>
+      <w:rFonts w:ascii="Times New Roman" w:hAnsi="Times New Roman" w:eastAsia="Times New Roman" w:cs="Times New Roman"/>
+      <w:color w:val="000000"/>
     </w:rPr>
   </w:style>
   <w:style w:type="character" w:customStyle="1" w:styleId="SpecialCharTok">
     <w:name w:val="SpecialCharTok"/>
     <w:basedOn w:val="VerbatimChar"/>
     <w:rPr>
-      <w:color w:val="4070a0"/>
+      <w:rFonts w:ascii="Times New Roman" w:hAnsi="Times New Roman" w:eastAsia="Times New Roman" w:cs="Times New Roman"/>
+      <w:color w:val="000000"/>
     </w:rPr>
   </w:style>
   <w:style w:type="character" w:customStyle="1" w:styleId="StringTok">
     <w:name w:val="StringTok"/>
     <w:basedOn w:val="VerbatimChar"/>
     <w:rPr>
-      <w:color w:val="4070a0"/>
+      <w:rFonts w:ascii="Times New Roman" w:hAnsi="Times New Roman" w:eastAsia="Times New Roman" w:cs="Times New Roman"/>
+      <w:color w:val="000000"/>
     </w:rPr>
   </w:style>
   <w:style w:type="character" w:customStyle="1" w:styleId="VerbatimStringTok">
     <w:name w:val="VerbatimStringTok"/>
     <w:basedOn w:val="VerbatimChar"/>
     <w:rPr>
-      <w:color w:val="4070a0"/>
+      <w:rFonts w:ascii="Times New Roman" w:hAnsi="Times New Roman" w:eastAsia="Times New Roman" w:cs="Times New Roman"/>
+      <w:color w:val="000000"/>
     </w:rPr>
   </w:style>
   <w:style w:type="character" w:customStyle="1" w:styleId="SpecialStringTok">
     <w:name w:val="SpecialStringTok"/>
     <w:basedOn w:val="VerbatimChar"/>
     <w:rPr>
-      <w:color w:val="bb6688"/>
+      <w:rFonts w:ascii="Times New Roman" w:hAnsi="Times New Roman" w:eastAsia="Times New Roman" w:cs="Times New Roman"/>
+      <w:color w:val="000000"/>
     </w:rPr>
   </w:style>
   <w:style w:type="character" w:customStyle="1" w:styleId="ImportTok">
     <w:name w:val="ImportTok"/>
     <w:basedOn w:val="VerbatimChar"/>
     <w:rPr>
-      <w:color w:val="008000"/>
+      <w:rFonts w:ascii="Times New Roman" w:hAnsi="Times New Roman" w:eastAsia="Times New Roman" w:cs="Times New Roman"/>
+      <w:color w:val="000000"/>
       <w:b/>
     </w:rPr>
   </w:style>
@@ -1320,7 +2374,8 @@
     <w:name w:val="CommentTok"/>
     <w:basedOn w:val="VerbatimChar"/>
     <w:rPr>
-      <w:color w:val="60a0b0"/>
+      <w:rFonts w:ascii="Times New Roman" w:hAnsi="Times New Roman" w:eastAsia="Times New Roman" w:cs="Times New Roman"/>
+      <w:color w:val="000000"/>
       <w:i/>
     </w:rPr>
   </w:style>
@@ -1328,7 +2383,8 @@
     <w:name w:val="DocumentationTok"/>
     <w:basedOn w:val="VerbatimChar"/>
     <w:rPr>
-      <w:color w:val="ba2121"/>
+      <w:rFonts w:ascii="Times New Roman" w:hAnsi="Times New Roman" w:eastAsia="Times New Roman" w:cs="Times New Roman"/>
+      <w:color w:val="000000"/>
       <w:i/>
     </w:rPr>
   </w:style>
@@ -1336,7 +2392,8 @@
     <w:name w:val="AnnotationTok"/>
     <w:basedOn w:val="VerbatimChar"/>
     <w:rPr>
-      <w:color w:val="60a0b0"/>
+      <w:rFonts w:ascii="Times New Roman" w:hAnsi="Times New Roman" w:eastAsia="Times New Roman" w:cs="Times New Roman"/>
+      <w:color w:val="000000"/>
       <w:b/>
       <w:i/>
     </w:rPr>
@@ -1345,7 +2402,8 @@
     <w:name w:val="CommentVarTok"/>
     <w:basedOn w:val="VerbatimChar"/>
     <w:rPr>
-      <w:color w:val="60a0b0"/>
+      <w:rFonts w:ascii="Times New Roman" w:hAnsi="Times New Roman" w:eastAsia="Times New Roman" w:cs="Times New Roman"/>
+      <w:color w:val="000000"/>
       <w:b/>
       <w:i/>
     </w:rPr>
@@ -1354,28 +2412,32 @@
     <w:name w:val="OtherTok"/>
     <w:basedOn w:val="VerbatimChar"/>
     <w:rPr>
-      <w:color w:val="007020"/>
+      <w:rFonts w:ascii="Times New Roman" w:hAnsi="Times New Roman" w:eastAsia="Times New Roman" w:cs="Times New Roman"/>
+      <w:color w:val="000000"/>
     </w:rPr>
   </w:style>
   <w:style w:type="character" w:customStyle="1" w:styleId="FunctionTok">
     <w:name w:val="FunctionTok"/>
     <w:basedOn w:val="VerbatimChar"/>
     <w:rPr>
-      <w:color w:val="06287e"/>
+      <w:rFonts w:ascii="Times New Roman" w:hAnsi="Times New Roman" w:eastAsia="Times New Roman" w:cs="Times New Roman"/>
+      <w:color w:val="000000"/>
     </w:rPr>
   </w:style>
   <w:style w:type="character" w:customStyle="1" w:styleId="VariableTok">
     <w:name w:val="VariableTok"/>
     <w:basedOn w:val="VerbatimChar"/>
     <w:rPr>
-      <w:color w:val="19177c"/>
+      <w:rFonts w:ascii="Times New Roman" w:hAnsi="Times New Roman" w:eastAsia="Times New Roman" w:cs="Times New Roman"/>
+      <w:color w:val="000000"/>
     </w:rPr>
   </w:style>
   <w:style w:type="character" w:customStyle="1" w:styleId="ControlFlowTok">
     <w:name w:val="ControlFlowTok"/>
     <w:basedOn w:val="VerbatimChar"/>
     <w:rPr>
-      <w:color w:val="007020"/>
+      <w:rFonts w:ascii="Times New Roman" w:hAnsi="Times New Roman" w:eastAsia="Times New Roman" w:cs="Times New Roman"/>
+      <w:color w:val="000000"/>
       <w:b/>
     </w:rPr>
   </w:style>
@@ -1383,45 +2445,56 @@
     <w:name w:val="OperatorTok"/>
     <w:basedOn w:val="VerbatimChar"/>
     <w:rPr>
-      <w:color w:val="666666"/>
+      <w:rFonts w:ascii="Times New Roman" w:hAnsi="Times New Roman" w:eastAsia="Times New Roman" w:cs="Times New Roman"/>
+      <w:color w:val="000000"/>
     </w:rPr>
   </w:style>
   <w:style w:type="character" w:customStyle="1" w:styleId="BuiltInTok">
     <w:name w:val="BuiltInTok"/>
     <w:basedOn w:val="VerbatimChar"/>
     <w:rPr>
-      <w:color w:val="008000"/>
+      <w:rFonts w:ascii="Times New Roman" w:hAnsi="Times New Roman" w:eastAsia="Times New Roman" w:cs="Times New Roman"/>
+      <w:color w:val="000000"/>
     </w:rPr>
   </w:style>
   <w:style w:type="character" w:customStyle="1" w:styleId="ExtensionTok">
     <w:name w:val="ExtensionTok"/>
     <w:basedOn w:val="VerbatimChar"/>
-    <w:rPr/>
+    <w:rPr>
+      <w:rFonts w:ascii="Times New Roman" w:hAnsi="Times New Roman" w:eastAsia="Times New Roman" w:cs="Times New Roman"/>
+      <w:color w:val="000000"/>
+    </w:rPr>
   </w:style>
   <w:style w:type="character" w:customStyle="1" w:styleId="PreprocessorTok">
     <w:name w:val="PreprocessorTok"/>
     <w:basedOn w:val="VerbatimChar"/>
     <w:rPr>
-      <w:color w:val="bc7a00"/>
+      <w:rFonts w:ascii="Times New Roman" w:hAnsi="Times New Roman" w:eastAsia="Times New Roman" w:cs="Times New Roman"/>
+      <w:color w:val="000000"/>
     </w:rPr>
   </w:style>
   <w:style w:type="character" w:customStyle="1" w:styleId="AttributeTok">
     <w:name w:val="AttributeTok"/>
     <w:basedOn w:val="VerbatimChar"/>
     <w:rPr>
-      <w:color w:val="7d9029"/>
+      <w:rFonts w:ascii="Times New Roman" w:hAnsi="Times New Roman" w:eastAsia="Times New Roman" w:cs="Times New Roman"/>
+      <w:color w:val="000000"/>
     </w:rPr>
   </w:style>
   <w:style w:type="character" w:customStyle="1" w:styleId="RegionMarkerTok">
     <w:name w:val="RegionMarkerTok"/>
     <w:basedOn w:val="VerbatimChar"/>
-    <w:rPr/>
+    <w:rPr>
+      <w:rFonts w:ascii="Times New Roman" w:hAnsi="Times New Roman" w:eastAsia="Times New Roman" w:cs="Times New Roman"/>
+      <w:color w:val="000000"/>
+    </w:rPr>
   </w:style>
   <w:style w:type="character" w:customStyle="1" w:styleId="InformationTok">
     <w:name w:val="InformationTok"/>
     <w:basedOn w:val="VerbatimChar"/>
     <w:rPr>
-      <w:color w:val="60a0b0"/>
+      <w:rFonts w:ascii="Times New Roman" w:hAnsi="Times New Roman" w:eastAsia="Times New Roman" w:cs="Times New Roman"/>
+      <w:color w:val="000000"/>
       <w:b/>
       <w:i/>
     </w:rPr>
@@ -1430,7 +2503,8 @@
     <w:name w:val="WarningTok"/>
     <w:basedOn w:val="VerbatimChar"/>
     <w:rPr>
-      <w:color w:val="60a0b0"/>
+      <w:rFonts w:ascii="Times New Roman" w:hAnsi="Times New Roman" w:eastAsia="Times New Roman" w:cs="Times New Roman"/>
+      <w:color w:val="000000"/>
       <w:b/>
       <w:i/>
     </w:rPr>
@@ -1439,7 +2513,8 @@
     <w:name w:val="AlertTok"/>
     <w:basedOn w:val="VerbatimChar"/>
     <w:rPr>
-      <w:color w:val="ff0000"/>
+      <w:rFonts w:ascii="Times New Roman" w:hAnsi="Times New Roman" w:eastAsia="Times New Roman" w:cs="Times New Roman"/>
+      <w:color w:val="000000"/>
       <w:b/>
     </w:rPr>
   </w:style>
@@ -1447,14 +2522,18 @@
     <w:name w:val="ErrorTok"/>
     <w:basedOn w:val="VerbatimChar"/>
     <w:rPr>
-      <w:color w:val="ff0000"/>
+      <w:rFonts w:ascii="Times New Roman" w:hAnsi="Times New Roman" w:eastAsia="Times New Roman" w:cs="Times New Roman"/>
+      <w:color w:val="000000"/>
       <w:b/>
     </w:rPr>
   </w:style>
   <w:style w:type="character" w:customStyle="1" w:styleId="NormalTok">
     <w:name w:val="NormalTok"/>
     <w:basedOn w:val="VerbatimChar"/>
-    <w:rPr/>
+    <w:rPr>
+      <w:rFonts w:ascii="Times New Roman" w:hAnsi="Times New Roman" w:eastAsia="Times New Roman" w:cs="Times New Roman"/>
+      <w:color w:val="000000"/>
+    </w:rPr>
   </w:style>
 </w:styles>
 </file>

</xml_diff>